<commit_message>
docs(sprint12): R1 refondue - distinction V1 piliers / V2 ponderations semantiques P7B
</commit_message>
<xml_diff>
--- a/docs/OSA_Monte_Carlo_Recommandations_Conseil_Scientifique_v1.docx
+++ b/docs/OSA_Monte_Carlo_Recommandations_Conseil_Scientifique_v1.docx
@@ -1082,7 +1082,67 @@
                 <w:sz w:val="32"/>
                 <w:szCs w:val="32"/>
               </w:rPr>
-              <w:t xml:space="preserve">RECOMMANDATION 1 — Certifier la pondération égale provisoire</w:t>
+              <w:t xml:space="preserve">RECOMMANDATION 1 — Double certification de la pondération ISA</w:t>
+            </w:r>
+          </w:p>
+        </w:tc>
+      </w:tr>
+    </w:tbl>
+    <w:p>
+      <w:pPr>
+        <w:spacing w:after="100" w:before="100"/>
+      </w:pPr>
+      <w:r>
+        <w:t xml:space="preserve"/>
+      </w:r>
+    </w:p>
+    <w:tbl>
+      <w:tblPr>
+        <w:tblW w:type="dxa" w:w="9360"/>
+        <w:tblBorders>
+          <w:top w:val="single" w:color="auto" w:sz="4"/>
+          <w:left w:val="single" w:color="auto" w:sz="4"/>
+          <w:bottom w:val="single" w:color="auto" w:sz="4"/>
+          <w:right w:val="single" w:color="auto" w:sz="4"/>
+          <w:insideH w:val="single" w:color="auto" w:sz="4"/>
+          <w:insideV w:val="single" w:color="auto" w:sz="4"/>
+        </w:tblBorders>
+      </w:tblPr>
+      <w:tblGrid>
+        <w:gridCol w:w="9360"/>
+      </w:tblGrid>
+      <w:tr>
+        <w:tc>
+          <w:tcPr>
+            <w:tcW w:type="dxa" w:w="9360"/>
+            <w:tcBorders>
+              <w:top w:val="none" w:color="FFFFFF" w:sz="0"/>
+              <w:left w:val="none" w:color="FFFFFF" w:sz="0"/>
+              <w:bottom w:val="none" w:color="FFFFFF" w:sz="0"/>
+              <w:right w:val="none" w:color="FFFFFF" w:sz="0"/>
+            </w:tcBorders>
+            <w:shd w:fill="D6E4F0" w:val="clear"/>
+            <w:tcMar>
+              <w:top w:type="dxa" w:w="160"/>
+              <w:left w:type="dxa" w:w="240"/>
+              <w:bottom w:type="dxa" w:w="160"/>
+              <w:right w:type="dxa" w:w="240"/>
+            </w:tcMar>
+          </w:tcPr>
+          <w:p>
+            <w:pPr>
+              <w:jc w:val="both"/>
+            </w:pPr>
+            <w:r>
+              <w:rPr>
+                <w:rFonts w:ascii="Arial" w:cs="Arial" w:eastAsia="Arial" w:hAnsi="Arial"/>
+                <w:i/>
+                <w:iCs/>
+                <w:color w:val="1F4E79"/>
+                <w:sz w:val="22"/>
+                <w:szCs w:val="22"/>
+              </w:rPr>
+              <w:t xml:space="preserve">« L’ISA opère deux niveaux de pondération indépendants. Ces deux niveaux ont été traités différemment — l’un par décision technique implémentée, l’autre par décision de gouvernance provisoire. Tous deux nécessitent une validation académique formelle du Conseil scientifique avant certification de la publication ISA. »</w:t>
             </w:r>
           </w:p>
         </w:tc>
@@ -1110,7 +1170,7 @@
           <w:sz w:val="26"/>
           <w:szCs w:val="26"/>
         </w:rPr>
-        <w:t xml:space="preserve">Analyse 5W1H</w:t>
+        <w:t xml:space="preserve">Architecture de pondération ISA — deux niveaux distincts</w:t>
       </w:r>
     </w:p>
     <w:tbl>
@@ -1126,13 +1186,200 @@
         </w:tblBorders>
       </w:tblPr>
       <w:tblGrid>
-        <w:gridCol w:w="1800"/>
-        <w:gridCol w:w="7560"/>
+        <w:gridCol w:w="600"/>
+        <w:gridCol w:w="2400"/>
+        <w:gridCol w:w="3360"/>
+        <w:gridCol w:w="3000"/>
       </w:tblGrid>
       <w:tr>
         <w:tc>
           <w:tcPr>
-            <w:tcW w:type="dxa" w:w="1800"/>
+            <w:tcW w:type="dxa" w:w="600"/>
+            <w:tcBorders>
+              <w:top w:val="single" w:color="CCCCCC" w:sz="1"/>
+              <w:left w:val="single" w:color="CCCCCC" w:sz="1"/>
+              <w:bottom w:val="single" w:color="CCCCCC" w:sz="1"/>
+              <w:right w:val="single" w:color="CCCCCC" w:sz="1"/>
+            </w:tcBorders>
+            <w:shd w:fill="1F4E79" w:val="clear"/>
+            <w:tcMar>
+              <w:top w:type="dxa" w:w="80"/>
+              <w:left w:type="dxa" w:w="120"/>
+              <w:bottom w:type="dxa" w:w="80"/>
+              <w:right w:type="dxa" w:w="120"/>
+            </w:tcMar>
+            <w:vAlign w:val="top"/>
+          </w:tcPr>
+          <w:p>
+            <w:pPr>
+              <w:jc w:val="left"/>
+            </w:pPr>
+            <w:r>
+              <w:rPr>
+                <w:rFonts w:ascii="Arial" w:cs="Arial" w:eastAsia="Arial" w:hAnsi="Arial"/>
+                <w:b/>
+                <w:bCs/>
+                <w:i w:val="false"/>
+                <w:iCs w:val="false"/>
+                <w:color w:val="FFFFFF"/>
+                <w:sz w:val="20"/>
+                <w:szCs w:val="20"/>
+              </w:rPr>
+              <w:t xml:space="preserve">Niveau</w:t>
+            </w:r>
+          </w:p>
+        </w:tc>
+        <w:tc>
+          <w:tcPr>
+            <w:tcW w:type="dxa" w:w="2400"/>
+            <w:tcBorders>
+              <w:top w:val="single" w:color="CCCCCC" w:sz="1"/>
+              <w:left w:val="single" w:color="CCCCCC" w:sz="1"/>
+              <w:bottom w:val="single" w:color="CCCCCC" w:sz="1"/>
+              <w:right w:val="single" w:color="CCCCCC" w:sz="1"/>
+            </w:tcBorders>
+            <w:shd w:fill="1F4E79" w:val="clear"/>
+            <w:tcMar>
+              <w:top w:type="dxa" w:w="80"/>
+              <w:left w:type="dxa" w:w="120"/>
+              <w:bottom w:type="dxa" w:w="80"/>
+              <w:right w:type="dxa" w:w="120"/>
+            </w:tcMar>
+            <w:vAlign w:val="top"/>
+          </w:tcPr>
+          <w:p>
+            <w:pPr>
+              <w:jc w:val="left"/>
+            </w:pPr>
+            <w:r>
+              <w:rPr>
+                <w:rFonts w:ascii="Arial" w:cs="Arial" w:eastAsia="Arial" w:hAnsi="Arial"/>
+                <w:b/>
+                <w:bCs/>
+                <w:i w:val="false"/>
+                <w:iCs w:val="false"/>
+                <w:color w:val="FFFFFF"/>
+                <w:sz w:val="20"/>
+                <w:szCs w:val="20"/>
+              </w:rPr>
+              <w:t xml:space="preserve">Objet</w:t>
+            </w:r>
+          </w:p>
+        </w:tc>
+        <w:tc>
+          <w:tcPr>
+            <w:tcW w:type="dxa" w:w="3360"/>
+            <w:tcBorders>
+              <w:top w:val="single" w:color="CCCCCC" w:sz="1"/>
+              <w:left w:val="single" w:color="CCCCCC" w:sz="1"/>
+              <w:bottom w:val="single" w:color="CCCCCC" w:sz="1"/>
+              <w:right w:val="single" w:color="CCCCCC" w:sz="1"/>
+            </w:tcBorders>
+            <w:shd w:fill="1F4E79" w:val="clear"/>
+            <w:tcMar>
+              <w:top w:type="dxa" w:w="80"/>
+              <w:left w:type="dxa" w:w="120"/>
+              <w:bottom w:type="dxa" w:w="80"/>
+              <w:right w:type="dxa" w:w="120"/>
+            </w:tcMar>
+            <w:vAlign w:val="top"/>
+          </w:tcPr>
+          <w:p>
+            <w:pPr>
+              <w:jc w:val="left"/>
+            </w:pPr>
+            <w:r>
+              <w:rPr>
+                <w:rFonts w:ascii="Arial" w:cs="Arial" w:eastAsia="Arial" w:hAnsi="Arial"/>
+                <w:b/>
+                <w:bCs/>
+                <w:i w:val="false"/>
+                <w:iCs w:val="false"/>
+                <w:color w:val="FFFFFF"/>
+                <w:sz w:val="20"/>
+                <w:szCs w:val="20"/>
+              </w:rPr>
+              <w:t xml:space="preserve">Mécanisme</w:t>
+            </w:r>
+          </w:p>
+        </w:tc>
+        <w:tc>
+          <w:tcPr>
+            <w:tcW w:type="dxa" w:w="3000"/>
+            <w:tcBorders>
+              <w:top w:val="single" w:color="CCCCCC" w:sz="1"/>
+              <w:left w:val="single" w:color="CCCCCC" w:sz="1"/>
+              <w:bottom w:val="single" w:color="CCCCCC" w:sz="1"/>
+              <w:right w:val="single" w:color="CCCCCC" w:sz="1"/>
+            </w:tcBorders>
+            <w:shd w:fill="1F4E79" w:val="clear"/>
+            <w:tcMar>
+              <w:top w:type="dxa" w:w="80"/>
+              <w:left w:type="dxa" w:w="120"/>
+              <w:bottom w:type="dxa" w:w="80"/>
+              <w:right w:type="dxa" w:w="120"/>
+            </w:tcMar>
+            <w:vAlign w:val="top"/>
+          </w:tcPr>
+          <w:p>
+            <w:pPr>
+              <w:jc w:val="left"/>
+            </w:pPr>
+            <w:r>
+              <w:rPr>
+                <w:rFonts w:ascii="Arial" w:cs="Arial" w:eastAsia="Arial" w:hAnsi="Arial"/>
+                <w:b/>
+                <w:bCs/>
+                <w:i w:val="false"/>
+                <w:iCs w:val="false"/>
+                <w:color w:val="FFFFFF"/>
+                <w:sz w:val="20"/>
+                <w:szCs w:val="20"/>
+              </w:rPr>
+              <w:t xml:space="preserve">Statut</w:t>
+            </w:r>
+          </w:p>
+        </w:tc>
+      </w:tr>
+      <w:tr>
+        <w:tc>
+          <w:tcPr>
+            <w:tcW w:type="dxa" w:w="600"/>
+            <w:tcBorders>
+              <w:top w:val="single" w:color="CCCCCC" w:sz="1"/>
+              <w:left w:val="single" w:color="CCCCCC" w:sz="1"/>
+              <w:bottom w:val="single" w:color="CCCCCC" w:sz="1"/>
+              <w:right w:val="single" w:color="CCCCCC" w:sz="1"/>
+            </w:tcBorders>
+            <w:shd w:fill="2E75B6" w:val="clear"/>
+            <w:tcMar>
+              <w:top w:type="dxa" w:w="80"/>
+              <w:left w:type="dxa" w:w="80"/>
+              <w:bottom w:type="dxa" w:w="80"/>
+              <w:right w:type="dxa" w:w="80"/>
+            </w:tcMar>
+            <w:vAlign w:val="center"/>
+          </w:tcPr>
+          <w:p>
+            <w:pPr>
+              <w:jc w:val="center"/>
+            </w:pPr>
+            <w:r>
+              <w:rPr>
+                <w:rFonts w:ascii="Arial" w:cs="Arial" w:eastAsia="Arial" w:hAnsi="Arial"/>
+                <w:b/>
+                <w:bCs/>
+                <w:color w:val="FFFFFF"/>
+                <w:sz w:val="24"/>
+                <w:szCs w:val="24"/>
+              </w:rPr>
+              <w:t xml:space="preserve">N2</w:t>
+            </w:r>
+          </w:p>
+        </w:tc>
+        <w:tc>
+          <w:tcPr>
+            <w:tcW w:type="dxa" w:w="2400"/>
             <w:tcBorders>
               <w:top w:val="single" w:color="CCCCCC" w:sz="1"/>
               <w:left w:val="single" w:color="CCCCCC" w:sz="1"/>
@@ -1163,13 +1410,13 @@
                 <w:sz w:val="20"/>
                 <w:szCs w:val="20"/>
               </w:rPr>
-              <w:t xml:space="preserve">WHAT — Quoi</w:t>
-            </w:r>
-          </w:p>
-        </w:tc>
-        <w:tc>
-          <w:tcPr>
-            <w:tcW w:type="dxa" w:w="7560"/>
+              <w:t xml:space="preserve">Pondération des indicateurs au sein de chaque pilier</w:t>
+            </w:r>
+          </w:p>
+        </w:tc>
+        <w:tc>
+          <w:tcPr>
+            <w:tcW w:type="dxa" w:w="3360"/>
             <w:tcBorders>
               <w:top w:val="single" w:color="CCCCCC" w:sz="1"/>
               <w:left w:val="single" w:color="CCCCCC" w:sz="1"/>
@@ -1199,7 +1446,44 @@
                 <w:sz w:val="20"/>
                 <w:szCs w:val="20"/>
               </w:rPr>
-              <w:t xml:space="preserve">Certifier formellement que la pondération égale (0,10 par pilier) est la référence méthodologique officielle pour la publication ISA de septembre 2027.</w:t>
+              <w:t xml:space="preserve">Pondération sémantique différenciée via gouvernance P7B — 5 dimensions par indicateur : souveraineté, vulnérabilité, forecastabilité, confiance, ML-readiness. Table rf.semantic_governance_matrix.</w:t>
+            </w:r>
+          </w:p>
+        </w:tc>
+        <w:tc>
+          <w:tcPr>
+            <w:tcW w:type="dxa" w:w="3000"/>
+            <w:tcBorders>
+              <w:top w:val="single" w:color="CCCCCC" w:sz="1"/>
+              <w:left w:val="single" w:color="CCCCCC" w:sz="1"/>
+              <w:bottom w:val="single" w:color="CCCCCC" w:sz="1"/>
+              <w:right w:val="single" w:color="CCCCCC" w:sz="1"/>
+            </w:tcBorders>
+            <w:shd w:fill="E2EFDA" w:val="clear"/>
+            <w:tcMar>
+              <w:top w:type="dxa" w:w="80"/>
+              <w:left w:type="dxa" w:w="120"/>
+              <w:bottom w:type="dxa" w:w="80"/>
+              <w:right w:type="dxa" w:w="120"/>
+            </w:tcMar>
+            <w:vAlign w:val="top"/>
+          </w:tcPr>
+          <w:p>
+            <w:pPr>
+              <w:jc w:val="left"/>
+            </w:pPr>
+            <w:r>
+              <w:rPr>
+                <w:rFonts w:ascii="Arial" w:cs="Arial" w:eastAsia="Arial" w:hAnsi="Arial"/>
+                <w:b/>
+                <w:bCs/>
+                <w:i w:val="false"/>
+                <w:iCs w:val="false"/>
+                <w:color w:val="375623"/>
+                <w:sz w:val="20"/>
+                <w:szCs w:val="20"/>
+              </w:rPr>
+              <w:t xml:space="preserve">Décision technique implémentée — robustesse D2 = 0,959 — validation formelle requise</w:t>
             </w:r>
           </w:p>
         </w:tc>
@@ -1207,7 +1491,42 @@
       <w:tr>
         <w:tc>
           <w:tcPr>
-            <w:tcW w:type="dxa" w:w="1800"/>
+            <w:tcW w:type="dxa" w:w="600"/>
+            <w:tcBorders>
+              <w:top w:val="single" w:color="CCCCCC" w:sz="1"/>
+              <w:left w:val="single" w:color="CCCCCC" w:sz="1"/>
+              <w:bottom w:val="single" w:color="CCCCCC" w:sz="1"/>
+              <w:right w:val="single" w:color="CCCCCC" w:sz="1"/>
+            </w:tcBorders>
+            <w:shd w:fill="1F4E79" w:val="clear"/>
+            <w:tcMar>
+              <w:top w:type="dxa" w:w="80"/>
+              <w:left w:type="dxa" w:w="80"/>
+              <w:bottom w:type="dxa" w:w="80"/>
+              <w:right w:type="dxa" w:w="80"/>
+            </w:tcMar>
+            <w:vAlign w:val="center"/>
+          </w:tcPr>
+          <w:p>
+            <w:pPr>
+              <w:jc w:val="center"/>
+            </w:pPr>
+            <w:r>
+              <w:rPr>
+                <w:rFonts w:ascii="Arial" w:cs="Arial" w:eastAsia="Arial" w:hAnsi="Arial"/>
+                <w:b/>
+                <w:bCs/>
+                <w:color w:val="FFFFFF"/>
+                <w:sz w:val="24"/>
+                <w:szCs w:val="24"/>
+              </w:rPr>
+              <w:t xml:space="preserve">N1</w:t>
+            </w:r>
+          </w:p>
+        </w:tc>
+        <w:tc>
+          <w:tcPr>
+            <w:tcW w:type="dxa" w:w="2400"/>
             <w:tcBorders>
               <w:top w:val="single" w:color="CCCCCC" w:sz="1"/>
               <w:left w:val="single" w:color="CCCCCC" w:sz="1"/>
@@ -1238,13 +1557,13 @@
                 <w:sz w:val="20"/>
                 <w:szCs w:val="20"/>
               </w:rPr>
-              <w:t xml:space="preserve">WHO — Qui</w:t>
-            </w:r>
-          </w:p>
-        </w:tc>
-        <w:tc>
-          <w:tcPr>
-            <w:tcW w:type="dxa" w:w="7560"/>
+              <w:t xml:space="preserve">Pondération des 10 piliers souverains</w:t>
+            </w:r>
+          </w:p>
+        </w:tc>
+        <w:tc>
+          <w:tcPr>
+            <w:tcW w:type="dxa" w:w="3360"/>
             <w:tcBorders>
               <w:top w:val="single" w:color="CCCCCC" w:sz="1"/>
               <w:left w:val="single" w:color="CCCCCC" w:sz="1"/>
@@ -1274,307 +1593,44 @@
                 <w:sz w:val="20"/>
                 <w:szCs w:val="20"/>
               </w:rPr>
-              <w:t xml:space="preserve">Conseil scientifique panafricain — vote à majorité qualifiée (2/3) requis selon la Charte de neutralité scientifique.</w:t>
-            </w:r>
-          </w:p>
-        </w:tc>
-      </w:tr>
-      <w:tr>
-        <w:tc>
-          <w:tcPr>
-            <w:tcW w:type="dxa" w:w="1800"/>
-            <w:tcBorders>
-              <w:top w:val="single" w:color="CCCCCC" w:sz="1"/>
-              <w:left w:val="single" w:color="CCCCCC" w:sz="1"/>
-              <w:bottom w:val="single" w:color="CCCCCC" w:sz="1"/>
-              <w:right w:val="single" w:color="CCCCCC" w:sz="1"/>
-            </w:tcBorders>
-            <w:shd w:fill="D6E4F0" w:val="clear"/>
-            <w:tcMar>
-              <w:top w:type="dxa" w:w="80"/>
-              <w:left w:type="dxa" w:w="120"/>
-              <w:bottom w:type="dxa" w:w="80"/>
-              <w:right w:type="dxa" w:w="120"/>
-            </w:tcMar>
-            <w:vAlign w:val="top"/>
-          </w:tcPr>
-          <w:p>
-            <w:pPr>
-              <w:jc w:val="left"/>
-            </w:pPr>
-            <w:r>
-              <w:rPr>
-                <w:rFonts w:ascii="Arial" w:cs="Arial" w:eastAsia="Arial" w:hAnsi="Arial"/>
-                <w:b/>
-                <w:bCs/>
-                <w:i w:val="false"/>
-                <w:iCs w:val="false"/>
-                <w:color w:val="1F4E79"/>
-                <w:sz w:val="20"/>
-                <w:szCs w:val="20"/>
-              </w:rPr>
-              <w:t xml:space="preserve">WHEN — Quand</w:t>
-            </w:r>
-          </w:p>
-        </w:tc>
-        <w:tc>
-          <w:tcPr>
-            <w:tcW w:type="dxa" w:w="7560"/>
-            <w:tcBorders>
-              <w:top w:val="single" w:color="CCCCCC" w:sz="1"/>
-              <w:left w:val="single" w:color="CCCCCC" w:sz="1"/>
-              <w:bottom w:val="single" w:color="CCCCCC" w:sz="1"/>
-              <w:right w:val="single" w:color="CCCCCC" w:sz="1"/>
-            </w:tcBorders>
-            <w:tcMar>
-              <w:top w:type="dxa" w:w="80"/>
-              <w:left w:type="dxa" w:w="120"/>
-              <w:bottom w:type="dxa" w:w="80"/>
-              <w:right w:type="dxa" w:w="120"/>
-            </w:tcMar>
-            <w:vAlign w:val="top"/>
-          </w:tcPr>
-          <w:p>
-            <w:pPr>
-              <w:jc w:val="left"/>
-            </w:pPr>
-            <w:r>
-              <w:rPr>
-                <w:rFonts w:ascii="Arial" w:cs="Arial" w:eastAsia="Arial" w:hAnsi="Arial"/>
-                <w:b w:val="false"/>
-                <w:bCs w:val="false"/>
-                <w:i w:val="false"/>
-                <w:iCs w:val="false"/>
-                <w:color w:val="000000"/>
-                <w:sz w:val="20"/>
-                <w:szCs w:val="20"/>
-              </w:rPr>
-              <w:t xml:space="preserve">Session de certification — juin 2027, avant le lancement officiel du 3 septembre 2027.</w:t>
-            </w:r>
-          </w:p>
-        </w:tc>
-      </w:tr>
-      <w:tr>
-        <w:tc>
-          <w:tcPr>
-            <w:tcW w:type="dxa" w:w="1800"/>
-            <w:tcBorders>
-              <w:top w:val="single" w:color="CCCCCC" w:sz="1"/>
-              <w:left w:val="single" w:color="CCCCCC" w:sz="1"/>
-              <w:bottom w:val="single" w:color="CCCCCC" w:sz="1"/>
-              <w:right w:val="single" w:color="CCCCCC" w:sz="1"/>
-            </w:tcBorders>
-            <w:shd w:fill="D6E4F0" w:val="clear"/>
-            <w:tcMar>
-              <w:top w:type="dxa" w:w="80"/>
-              <w:left w:type="dxa" w:w="120"/>
-              <w:bottom w:type="dxa" w:w="80"/>
-              <w:right w:type="dxa" w:w="120"/>
-            </w:tcMar>
-            <w:vAlign w:val="top"/>
-          </w:tcPr>
-          <w:p>
-            <w:pPr>
-              <w:jc w:val="left"/>
-            </w:pPr>
-            <w:r>
-              <w:rPr>
-                <w:rFonts w:ascii="Arial" w:cs="Arial" w:eastAsia="Arial" w:hAnsi="Arial"/>
-                <w:b/>
-                <w:bCs/>
-                <w:i w:val="false"/>
-                <w:iCs w:val="false"/>
-                <w:color w:val="1F4E79"/>
-                <w:sz w:val="20"/>
-                <w:szCs w:val="20"/>
-              </w:rPr>
-              <w:t xml:space="preserve">WHERE — Où</w:t>
-            </w:r>
-          </w:p>
-        </w:tc>
-        <w:tc>
-          <w:tcPr>
-            <w:tcW w:type="dxa" w:w="7560"/>
-            <w:tcBorders>
-              <w:top w:val="single" w:color="CCCCCC" w:sz="1"/>
-              <w:left w:val="single" w:color="CCCCCC" w:sz="1"/>
-              <w:bottom w:val="single" w:color="CCCCCC" w:sz="1"/>
-              <w:right w:val="single" w:color="CCCCCC" w:sz="1"/>
-            </w:tcBorders>
-            <w:tcMar>
-              <w:top w:type="dxa" w:w="80"/>
-              <w:left w:type="dxa" w:w="120"/>
-              <w:bottom w:type="dxa" w:w="80"/>
-              <w:right w:type="dxa" w:w="120"/>
-            </w:tcMar>
-            <w:vAlign w:val="top"/>
-          </w:tcPr>
-          <w:p>
-            <w:pPr>
-              <w:jc w:val="left"/>
-            </w:pPr>
-            <w:r>
-              <w:rPr>
-                <w:rFonts w:ascii="Arial" w:cs="Arial" w:eastAsia="Arial" w:hAnsi="Arial"/>
-                <w:b w:val="false"/>
-                <w:bCs w:val="false"/>
-                <w:i w:val="false"/>
-                <w:iCs w:val="false"/>
-                <w:color w:val="000000"/>
-                <w:sz w:val="20"/>
-                <w:szCs w:val="20"/>
-              </w:rPr>
-              <w:t xml:space="preserve">Session plénière du Conseil — en présentiel recommandé pour la première certification officielle ISA.</w:t>
-            </w:r>
-          </w:p>
-        </w:tc>
-      </w:tr>
-      <w:tr>
-        <w:tc>
-          <w:tcPr>
-            <w:tcW w:type="dxa" w:w="1800"/>
-            <w:tcBorders>
-              <w:top w:val="single" w:color="CCCCCC" w:sz="1"/>
-              <w:left w:val="single" w:color="CCCCCC" w:sz="1"/>
-              <w:bottom w:val="single" w:color="CCCCCC" w:sz="1"/>
-              <w:right w:val="single" w:color="CCCCCC" w:sz="1"/>
-            </w:tcBorders>
-            <w:shd w:fill="D6E4F0" w:val="clear"/>
-            <w:tcMar>
-              <w:top w:type="dxa" w:w="80"/>
-              <w:left w:type="dxa" w:w="120"/>
-              <w:bottom w:type="dxa" w:w="80"/>
-              <w:right w:type="dxa" w:w="120"/>
-            </w:tcMar>
-            <w:vAlign w:val="top"/>
-          </w:tcPr>
-          <w:p>
-            <w:pPr>
-              <w:jc w:val="left"/>
-            </w:pPr>
-            <w:r>
-              <w:rPr>
-                <w:rFonts w:ascii="Arial" w:cs="Arial" w:eastAsia="Arial" w:hAnsi="Arial"/>
-                <w:b/>
-                <w:bCs/>
-                <w:i w:val="false"/>
-                <w:iCs w:val="false"/>
-                <w:color w:val="1F4E79"/>
-                <w:sz w:val="20"/>
-                <w:szCs w:val="20"/>
-              </w:rPr>
-              <w:t xml:space="preserve">WHY — Pourquoi</w:t>
-            </w:r>
-          </w:p>
-        </w:tc>
-        <w:tc>
-          <w:tcPr>
-            <w:tcW w:type="dxa" w:w="7560"/>
-            <w:tcBorders>
-              <w:top w:val="single" w:color="CCCCCC" w:sz="1"/>
-              <w:left w:val="single" w:color="CCCCCC" w:sz="1"/>
-              <w:bottom w:val="single" w:color="CCCCCC" w:sz="1"/>
-              <w:right w:val="single" w:color="CCCCCC" w:sz="1"/>
-            </w:tcBorders>
-            <w:tcMar>
-              <w:top w:type="dxa" w:w="80"/>
-              <w:left w:type="dxa" w:w="120"/>
-              <w:bottom w:type="dxa" w:w="80"/>
-              <w:right w:type="dxa" w:w="120"/>
-            </w:tcMar>
-            <w:vAlign w:val="top"/>
-          </w:tcPr>
-          <w:p>
-            <w:pPr>
-              <w:jc w:val="left"/>
-            </w:pPr>
-            <w:r>
-              <w:rPr>
-                <w:rFonts w:ascii="Arial" w:cs="Arial" w:eastAsia="Arial" w:hAnsi="Arial"/>
-                <w:b w:val="false"/>
-                <w:bCs w:val="false"/>
-                <w:i w:val="false"/>
-                <w:iCs w:val="false"/>
-                <w:color w:val="000000"/>
-                <w:sz w:val="20"/>
-                <w:szCs w:val="20"/>
-              </w:rPr>
-              <w:t xml:space="preserve">Sans certification formelle, toute contestation externe d’un gouvernement africain sur les pondérations fragilise la publication. La certification transforme un choix technique en décision académique validée et opposable.</w:t>
-            </w:r>
-          </w:p>
-        </w:tc>
-      </w:tr>
-      <w:tr>
-        <w:tc>
-          <w:tcPr>
-            <w:tcW w:type="dxa" w:w="1800"/>
-            <w:tcBorders>
-              <w:top w:val="single" w:color="CCCCCC" w:sz="1"/>
-              <w:left w:val="single" w:color="CCCCCC" w:sz="1"/>
-              <w:bottom w:val="single" w:color="CCCCCC" w:sz="1"/>
-              <w:right w:val="single" w:color="CCCCCC" w:sz="1"/>
-            </w:tcBorders>
-            <w:shd w:fill="D6E4F0" w:val="clear"/>
-            <w:tcMar>
-              <w:top w:type="dxa" w:w="80"/>
-              <w:left w:type="dxa" w:w="120"/>
-              <w:bottom w:type="dxa" w:w="80"/>
-              <w:right w:type="dxa" w:w="120"/>
-            </w:tcMar>
-            <w:vAlign w:val="top"/>
-          </w:tcPr>
-          <w:p>
-            <w:pPr>
-              <w:jc w:val="left"/>
-            </w:pPr>
-            <w:r>
-              <w:rPr>
-                <w:rFonts w:ascii="Arial" w:cs="Arial" w:eastAsia="Arial" w:hAnsi="Arial"/>
-                <w:b/>
-                <w:bCs/>
-                <w:i w:val="false"/>
-                <w:iCs w:val="false"/>
-                <w:color w:val="1F4E79"/>
-                <w:sz w:val="20"/>
-                <w:szCs w:val="20"/>
-              </w:rPr>
-              <w:t xml:space="preserve">HOW — Comment</w:t>
-            </w:r>
-          </w:p>
-        </w:tc>
-        <w:tc>
-          <w:tcPr>
-            <w:tcW w:type="dxa" w:w="7560"/>
-            <w:tcBorders>
-              <w:top w:val="single" w:color="CCCCCC" w:sz="1"/>
-              <w:left w:val="single" w:color="CCCCCC" w:sz="1"/>
-              <w:bottom w:val="single" w:color="CCCCCC" w:sz="1"/>
-              <w:right w:val="single" w:color="CCCCCC" w:sz="1"/>
-            </w:tcBorders>
-            <w:tcMar>
-              <w:top w:type="dxa" w:w="80"/>
-              <w:left w:type="dxa" w:w="120"/>
-              <w:bottom w:type="dxa" w:w="80"/>
-              <w:right w:type="dxa" w:w="120"/>
-            </w:tcMar>
-            <w:vAlign w:val="top"/>
-          </w:tcPr>
-          <w:p>
-            <w:pPr>
-              <w:jc w:val="left"/>
-            </w:pPr>
-            <w:r>
-              <w:rPr>
-                <w:rFonts w:ascii="Arial" w:cs="Arial" w:eastAsia="Arial" w:hAnsi="Arial"/>
-                <w:b w:val="false"/>
-                <w:bCs w:val="false"/>
-                <w:i w:val="false"/>
-                <w:iCs w:val="false"/>
-                <w:color w:val="000000"/>
-                <w:sz w:val="20"/>
-                <w:szCs w:val="20"/>
-              </w:rPr>
-              <w:t xml:space="preserve">Présentation du rapport Monte Carlo complet + débat sur les cas SYC et pays atypiques + vote formel + signature du certificat ISA_P7E_V1.</w:t>
+              <w:t xml:space="preserve">Pondération égale provisoire 0,10 par pilier. Aucune hiérarchie entre piliers — neutralité politique pendant la phase d’appropriation 2026.</w:t>
+            </w:r>
+          </w:p>
+        </w:tc>
+        <w:tc>
+          <w:tcPr>
+            <w:tcW w:type="dxa" w:w="3000"/>
+            <w:tcBorders>
+              <w:top w:val="single" w:color="CCCCCC" w:sz="1"/>
+              <w:left w:val="single" w:color="CCCCCC" w:sz="1"/>
+              <w:bottom w:val="single" w:color="CCCCCC" w:sz="1"/>
+              <w:right w:val="single" w:color="CCCCCC" w:sz="1"/>
+            </w:tcBorders>
+            <w:shd w:fill="FFF2CC" w:val="clear"/>
+            <w:tcMar>
+              <w:top w:type="dxa" w:w="80"/>
+              <w:left w:type="dxa" w:w="120"/>
+              <w:bottom w:type="dxa" w:w="80"/>
+              <w:right w:type="dxa" w:w="120"/>
+            </w:tcMar>
+            <w:vAlign w:val="top"/>
+          </w:tcPr>
+          <w:p>
+            <w:pPr>
+              <w:jc w:val="left"/>
+            </w:pPr>
+            <w:r>
+              <w:rPr>
+                <w:rFonts w:ascii="Arial" w:cs="Arial" w:eastAsia="Arial" w:hAnsi="Arial"/>
+                <w:b/>
+                <w:bCs/>
+                <w:i w:val="false"/>
+                <w:iCs w:val="false"/>
+                <w:color w:val="7F6000"/>
+                <w:sz w:val="20"/>
+                <w:szCs w:val="20"/>
+              </w:rPr>
+              <w:t xml:space="preserve">Décision de gouvernance provisoire — robustesse D1 = 0,847 — certification requise</w:t>
             </w:r>
           </w:p>
         </w:tc>
@@ -1602,7 +1658,34 @@
           <w:sz w:val="26"/>
           <w:szCs w:val="26"/>
         </w:rPr>
-        <w:t xml:space="preserve">Analyse SWOT</w:t>
+        <w:t xml:space="preserve">Vote V2 — Approbation de la pondération sémantique des indicateurs (Niveau 2)</w:t>
+      </w:r>
+    </w:p>
+    <w:p>
+      <w:pPr>
+        <w:spacing w:after="80" w:before="80"/>
+        <w:jc w:val="both"/>
+      </w:pPr>
+      <w:r>
+        <w:rPr>
+          <w:rFonts w:ascii="Arial" w:cs="Arial" w:eastAsia="Arial" w:hAnsi="Arial"/>
+          <w:b w:val="false"/>
+          <w:bCs w:val="false"/>
+          <w:i w:val="false"/>
+          <w:iCs w:val="false"/>
+          <w:color w:val="000000"/>
+          <w:sz w:val="22"/>
+          <w:szCs w:val="22"/>
+        </w:rPr>
+        <w:t xml:space="preserve">La pondération sémantique P7B est une décision technique déjà implémentée et validée par Monte Carlo (D2 robustesse = 0,959). Le Conseil ne la redécide pas — il la valide comme doctrinalement cohérente et scientifiquement défendable.</w:t>
+      </w:r>
+    </w:p>
+    <w:p>
+      <w:pPr>
+        <w:spacing w:after="100" w:before="100"/>
+      </w:pPr>
+      <w:r>
+        <w:t xml:space="preserve"/>
       </w:r>
     </w:p>
     <w:tbl>
@@ -1618,223 +1701,81 @@
         </w:tblBorders>
       </w:tblPr>
       <w:tblGrid>
-        <w:gridCol w:w="4680"/>
-        <w:gridCol w:w="4680"/>
+        <w:gridCol w:w="1800"/>
+        <w:gridCol w:w="7560"/>
       </w:tblGrid>
       <w:tr>
         <w:tc>
           <w:tcPr>
-            <w:tcW w:type="dxa" w:w="4680"/>
-            <w:tcBorders>
-              <w:top w:val="single" w:color="CCCCCC" w:sz="1"/>
-              <w:left w:val="single" w:color="CCCCCC" w:sz="1"/>
-              <w:bottom w:val="single" w:color="CCCCCC" w:sz="1"/>
-              <w:right w:val="single" w:color="CCCCCC" w:sz="1"/>
-            </w:tcBorders>
-            <w:shd w:fill="E2EFDA" w:val="clear"/>
-            <w:tcMar>
-              <w:top w:type="dxa" w:w="100"/>
-              <w:left w:type="dxa" w:w="120"/>
-              <w:bottom w:type="dxa" w:w="100"/>
-              <w:right w:type="dxa" w:w="120"/>
-            </w:tcMar>
-          </w:tcPr>
-          <w:p>
-            <w:r>
-              <w:rPr>
-                <w:rFonts w:ascii="Arial" w:cs="Arial" w:eastAsia="Arial" w:hAnsi="Arial"/>
-                <w:b/>
-                <w:bCs/>
-                <w:color w:val="375623"/>
-                <w:sz w:val="20"/>
-                <w:szCs w:val="20"/>
-              </w:rPr>
-              <w:t xml:space="preserve">Forces</w:t>
-            </w:r>
-          </w:p>
-          <w:p>
-            <w:pPr>
-              <w:spacing w:before="40"/>
-            </w:pPr>
-            <w:r>
-              <w:rPr>
-                <w:rFonts w:ascii="Arial" w:cs="Arial" w:eastAsia="Arial" w:hAnsi="Arial"/>
-                <w:color w:val="375623"/>
-                <w:sz w:val="20"/>
-                <w:szCs w:val="20"/>
-              </w:rPr>
-              <w:t xml:space="preserve">•  </w:t>
-            </w:r>
-            <w:r>
-              <w:rPr>
-                <w:rFonts w:ascii="Arial" w:cs="Arial" w:eastAsia="Arial" w:hAnsi="Arial"/>
-                <w:sz w:val="20"/>
-                <w:szCs w:val="20"/>
-              </w:rPr>
-              <w:t xml:space="preserve">Robustesse prouvée par Monte Carlo (0,847)</w:t>
-            </w:r>
-          </w:p>
-          <w:p>
-            <w:pPr>
-              <w:spacing w:before="40"/>
-            </w:pPr>
-            <w:r>
-              <w:rPr>
-                <w:rFonts w:ascii="Arial" w:cs="Arial" w:eastAsia="Arial" w:hAnsi="Arial"/>
-                <w:color w:val="375623"/>
-                <w:sz w:val="20"/>
-                <w:szCs w:val="20"/>
-              </w:rPr>
-              <w:t xml:space="preserve">•  </w:t>
-            </w:r>
-            <w:r>
-              <w:rPr>
-                <w:rFonts w:ascii="Arial" w:cs="Arial" w:eastAsia="Arial" w:hAnsi="Arial"/>
-                <w:sz w:val="20"/>
-                <w:szCs w:val="20"/>
-              </w:rPr>
-              <w:t xml:space="preserve">Neutralité politique — aucun pilier favorisé</w:t>
-            </w:r>
-          </w:p>
-          <w:p>
-            <w:pPr>
-              <w:spacing w:before="40"/>
-            </w:pPr>
-            <w:r>
-              <w:rPr>
-                <w:rFonts w:ascii="Arial" w:cs="Arial" w:eastAsia="Arial" w:hAnsi="Arial"/>
-                <w:color w:val="375623"/>
-                <w:sz w:val="20"/>
-                <w:szCs w:val="20"/>
-              </w:rPr>
-              <w:t xml:space="preserve">•  </w:t>
-            </w:r>
-            <w:r>
-              <w:rPr>
-                <w:rFonts w:ascii="Arial" w:cs="Arial" w:eastAsia="Arial" w:hAnsi="Arial"/>
-                <w:sz w:val="20"/>
-                <w:szCs w:val="20"/>
-              </w:rPr>
-              <w:t xml:space="preserve">Simple à expliquer aux partenaires institutionnels</w:t>
-            </w:r>
-          </w:p>
-          <w:p>
-            <w:pPr>
-              <w:spacing w:before="40"/>
-            </w:pPr>
-            <w:r>
-              <w:rPr>
-                <w:rFonts w:ascii="Arial" w:cs="Arial" w:eastAsia="Arial" w:hAnsi="Arial"/>
-                <w:color w:val="375623"/>
-                <w:sz w:val="20"/>
-                <w:szCs w:val="20"/>
-              </w:rPr>
-              <w:t xml:space="preserve">•  </w:t>
-            </w:r>
-            <w:r>
-              <w:rPr>
-                <w:rFonts w:ascii="Arial" w:cs="Arial" w:eastAsia="Arial" w:hAnsi="Arial"/>
-                <w:sz w:val="20"/>
-                <w:szCs w:val="20"/>
-              </w:rPr>
-              <w:t xml:space="preserve">Cohérente avec les standards PNUD/IDH</w:t>
-            </w:r>
-          </w:p>
-        </w:tc>
-        <w:tc>
-          <w:tcPr>
-            <w:tcW w:type="dxa" w:w="4680"/>
-            <w:tcBorders>
-              <w:top w:val="single" w:color="CCCCCC" w:sz="1"/>
-              <w:left w:val="single" w:color="CCCCCC" w:sz="1"/>
-              <w:bottom w:val="single" w:color="CCCCCC" w:sz="1"/>
-              <w:right w:val="single" w:color="CCCCCC" w:sz="1"/>
-            </w:tcBorders>
-            <w:shd w:fill="FCE4D6" w:val="clear"/>
-            <w:tcMar>
-              <w:top w:type="dxa" w:w="100"/>
-              <w:left w:type="dxa" w:w="120"/>
-              <w:bottom w:type="dxa" w:w="100"/>
-              <w:right w:type="dxa" w:w="120"/>
-            </w:tcMar>
-          </w:tcPr>
-          <w:p>
-            <w:r>
-              <w:rPr>
-                <w:rFonts w:ascii="Arial" w:cs="Arial" w:eastAsia="Arial" w:hAnsi="Arial"/>
-                <w:b/>
-                <w:bCs/>
-                <w:color w:val="C00000"/>
-                <w:sz w:val="20"/>
-                <w:szCs w:val="20"/>
-              </w:rPr>
-              <w:t xml:space="preserve">Faiblesses</w:t>
-            </w:r>
-          </w:p>
-          <w:p>
-            <w:pPr>
-              <w:spacing w:before="40"/>
-            </w:pPr>
-            <w:r>
-              <w:rPr>
-                <w:rFonts w:ascii="Arial" w:cs="Arial" w:eastAsia="Arial" w:hAnsi="Arial"/>
-                <w:color w:val="C00000"/>
-                <w:sz w:val="20"/>
-                <w:szCs w:val="20"/>
-              </w:rPr>
-              <w:t xml:space="preserve">•  </w:t>
-            </w:r>
-            <w:r>
-              <w:rPr>
-                <w:rFonts w:ascii="Arial" w:cs="Arial" w:eastAsia="Arial" w:hAnsi="Arial"/>
-                <w:sz w:val="20"/>
-                <w:szCs w:val="20"/>
-              </w:rPr>
-              <w:t xml:space="preserve">Provisoire par nature — ne reflète pas nécessairement les priorités souveraines africaines réelles</w:t>
-            </w:r>
-          </w:p>
-          <w:p>
-            <w:pPr>
-              <w:spacing w:before="40"/>
-            </w:pPr>
-            <w:r>
-              <w:rPr>
-                <w:rFonts w:ascii="Arial" w:cs="Arial" w:eastAsia="Arial" w:hAnsi="Arial"/>
-                <w:color w:val="C00000"/>
-                <w:sz w:val="20"/>
-                <w:szCs w:val="20"/>
-              </w:rPr>
-              <w:t xml:space="preserve">•  </w:t>
-            </w:r>
-            <w:r>
-              <w:rPr>
-                <w:rFonts w:ascii="Arial" w:cs="Arial" w:eastAsia="Arial" w:hAnsi="Arial"/>
-                <w:sz w:val="20"/>
-                <w:szCs w:val="20"/>
-              </w:rPr>
-              <w:t xml:space="preserve">SYC et petits États insulaires structurellement désavantasés (voir R3)</w:t>
-            </w:r>
-          </w:p>
-          <w:p>
-            <w:pPr>
-              <w:spacing w:before="40"/>
-            </w:pPr>
-            <w:r>
-              <w:rPr>
-                <w:rFonts w:ascii="Arial" w:cs="Arial" w:eastAsia="Arial" w:hAnsi="Arial"/>
-                <w:color w:val="C00000"/>
-                <w:sz w:val="20"/>
-                <w:szCs w:val="20"/>
-              </w:rPr>
-              <w:t xml:space="preserve">•  </w:t>
-            </w:r>
-            <w:r>
-              <w:rPr>
-                <w:rFonts w:ascii="Arial" w:cs="Arial" w:eastAsia="Arial" w:hAnsi="Arial"/>
-                <w:sz w:val="20"/>
-                <w:szCs w:val="20"/>
-              </w:rPr>
-              <w:t xml:space="preserve">Sensibilité modérée sur D1 — nécessite suivi</w:t>
+            <w:tcW w:type="dxa" w:w="1800"/>
+            <w:tcBorders>
+              <w:top w:val="single" w:color="CCCCCC" w:sz="1"/>
+              <w:left w:val="single" w:color="CCCCCC" w:sz="1"/>
+              <w:bottom w:val="single" w:color="CCCCCC" w:sz="1"/>
+              <w:right w:val="single" w:color="CCCCCC" w:sz="1"/>
+            </w:tcBorders>
+            <w:shd w:fill="1F4E79" w:val="clear"/>
+            <w:tcMar>
+              <w:top w:type="dxa" w:w="80"/>
+              <w:left w:type="dxa" w:w="120"/>
+              <w:bottom w:type="dxa" w:w="80"/>
+              <w:right w:type="dxa" w:w="120"/>
+            </w:tcMar>
+            <w:vAlign w:val="top"/>
+          </w:tcPr>
+          <w:p>
+            <w:pPr>
+              <w:jc w:val="left"/>
+            </w:pPr>
+            <w:r>
+              <w:rPr>
+                <w:rFonts w:ascii="Arial" w:cs="Arial" w:eastAsia="Arial" w:hAnsi="Arial"/>
+                <w:b/>
+                <w:bCs/>
+                <w:i w:val="false"/>
+                <w:iCs w:val="false"/>
+                <w:color w:val="FFFFFF"/>
+                <w:sz w:val="20"/>
+                <w:szCs w:val="20"/>
+              </w:rPr>
+              <w:t xml:space="preserve">Dimension</w:t>
+            </w:r>
+          </w:p>
+        </w:tc>
+        <w:tc>
+          <w:tcPr>
+            <w:tcW w:type="dxa" w:w="7560"/>
+            <w:tcBorders>
+              <w:top w:val="single" w:color="CCCCCC" w:sz="1"/>
+              <w:left w:val="single" w:color="CCCCCC" w:sz="1"/>
+              <w:bottom w:val="single" w:color="CCCCCC" w:sz="1"/>
+              <w:right w:val="single" w:color="CCCCCC" w:sz="1"/>
+            </w:tcBorders>
+            <w:shd w:fill="1F4E79" w:val="clear"/>
+            <w:tcMar>
+              <w:top w:type="dxa" w:w="80"/>
+              <w:left w:type="dxa" w:w="120"/>
+              <w:bottom w:type="dxa" w:w="80"/>
+              <w:right w:type="dxa" w:w="120"/>
+            </w:tcMar>
+            <w:vAlign w:val="top"/>
+          </w:tcPr>
+          <w:p>
+            <w:pPr>
+              <w:jc w:val="left"/>
+            </w:pPr>
+            <w:r>
+              <w:rPr>
+                <w:rFonts w:ascii="Arial" w:cs="Arial" w:eastAsia="Arial" w:hAnsi="Arial"/>
+                <w:b/>
+                <w:bCs/>
+                <w:i w:val="false"/>
+                <w:iCs w:val="false"/>
+                <w:color w:val="FFFFFF"/>
+                <w:sz w:val="20"/>
+                <w:szCs w:val="20"/>
+              </w:rPr>
+              <w:t xml:space="preserve">Contenu de la présentation au Conseil</w:t>
             </w:r>
           </w:p>
         </w:tc>
@@ -1842,7 +1783,7 @@
       <w:tr>
         <w:tc>
           <w:tcPr>
-            <w:tcW w:type="dxa" w:w="4680"/>
+            <w:tcW w:type="dxa" w:w="1800"/>
             <w:tcBorders>
               <w:top w:val="single" w:color="CCCCCC" w:sz="1"/>
               <w:left w:val="single" w:color="CCCCCC" w:sz="1"/>
@@ -1851,186 +1792,766 @@
             </w:tcBorders>
             <w:shd w:fill="D6E4F0" w:val="clear"/>
             <w:tcMar>
-              <w:top w:type="dxa" w:w="100"/>
-              <w:left w:type="dxa" w:w="120"/>
-              <w:bottom w:type="dxa" w:w="100"/>
-              <w:right w:type="dxa" w:w="120"/>
-            </w:tcMar>
-          </w:tcPr>
-          <w:p>
-            <w:r>
-              <w:rPr>
-                <w:rFonts w:ascii="Arial" w:cs="Arial" w:eastAsia="Arial" w:hAnsi="Arial"/>
-                <w:b/>
-                <w:bCs/>
-                <w:color w:val="2E75B6"/>
-                <w:sz w:val="20"/>
-                <w:szCs w:val="20"/>
-              </w:rPr>
-              <w:t xml:space="preserve">Opportunités</w:t>
-            </w:r>
-          </w:p>
-          <w:p>
-            <w:pPr>
-              <w:spacing w:before="40"/>
-            </w:pPr>
-            <w:r>
-              <w:rPr>
-                <w:rFonts w:ascii="Arial" w:cs="Arial" w:eastAsia="Arial" w:hAnsi="Arial"/>
-                <w:color w:val="2E75B6"/>
-                <w:sz w:val="20"/>
-                <w:szCs w:val="20"/>
-              </w:rPr>
-              <w:t xml:space="preserve">•  </w:t>
-            </w:r>
-            <w:r>
-              <w:rPr>
-                <w:rFonts w:ascii="Arial" w:cs="Arial" w:eastAsia="Arial" w:hAnsi="Arial"/>
-                <w:sz w:val="20"/>
-                <w:szCs w:val="20"/>
-              </w:rPr>
-              <w:t xml:space="preserve">Première certification académique d’un indice souverain africain</w:t>
-            </w:r>
-          </w:p>
-          <w:p>
-            <w:pPr>
-              <w:spacing w:before="40"/>
-            </w:pPr>
-            <w:r>
-              <w:rPr>
-                <w:rFonts w:ascii="Arial" w:cs="Arial" w:eastAsia="Arial" w:hAnsi="Arial"/>
-                <w:color w:val="2E75B6"/>
-                <w:sz w:val="20"/>
-                <w:szCs w:val="20"/>
-              </w:rPr>
-              <w:t xml:space="preserve">•  </w:t>
-            </w:r>
-            <w:r>
-              <w:rPr>
-                <w:rFonts w:ascii="Arial" w:cs="Arial" w:eastAsia="Arial" w:hAnsi="Arial"/>
-                <w:sz w:val="20"/>
-                <w:szCs w:val="20"/>
-              </w:rPr>
-              <w:t xml:space="preserve">Base de négociation stable avec les partenaires institutionnels</w:t>
-            </w:r>
-          </w:p>
-          <w:p>
-            <w:pPr>
-              <w:spacing w:before="40"/>
-            </w:pPr>
-            <w:r>
-              <w:rPr>
-                <w:rFonts w:ascii="Arial" w:cs="Arial" w:eastAsia="Arial" w:hAnsi="Arial"/>
-                <w:color w:val="2E75B6"/>
-                <w:sz w:val="20"/>
-                <w:szCs w:val="20"/>
-              </w:rPr>
-              <w:t xml:space="preserve">•  </w:t>
-            </w:r>
-            <w:r>
-              <w:rPr>
-                <w:rFonts w:ascii="Arial" w:cs="Arial" w:eastAsia="Arial" w:hAnsi="Arial"/>
-                <w:sz w:val="20"/>
-                <w:szCs w:val="20"/>
-              </w:rPr>
-              <w:t xml:space="preserve">Ouvre la voie à une différenciation future validée par les données 2025–2027</w:t>
-            </w:r>
-          </w:p>
-        </w:tc>
-        <w:tc>
-          <w:tcPr>
-            <w:tcW w:type="dxa" w:w="4680"/>
-            <w:tcBorders>
-              <w:top w:val="single" w:color="CCCCCC" w:sz="1"/>
-              <w:left w:val="single" w:color="CCCCCC" w:sz="1"/>
-              <w:bottom w:val="single" w:color="CCCCCC" w:sz="1"/>
-              <w:right w:val="single" w:color="CCCCCC" w:sz="1"/>
-            </w:tcBorders>
-            <w:shd w:fill="FFF2CC" w:val="clear"/>
-            <w:tcMar>
-              <w:top w:type="dxa" w:w="100"/>
-              <w:left w:type="dxa" w:w="120"/>
-              <w:bottom w:type="dxa" w:w="100"/>
-              <w:right w:type="dxa" w:w="120"/>
-            </w:tcMar>
-          </w:tcPr>
-          <w:p>
-            <w:r>
-              <w:rPr>
-                <w:rFonts w:ascii="Arial" w:cs="Arial" w:eastAsia="Arial" w:hAnsi="Arial"/>
-                <w:b/>
-                <w:bCs/>
-                <w:color w:val="7F6000"/>
-                <w:sz w:val="20"/>
-                <w:szCs w:val="20"/>
-              </w:rPr>
-              <w:t xml:space="preserve">Menaces</w:t>
-            </w:r>
-          </w:p>
-          <w:p>
-            <w:pPr>
-              <w:spacing w:before="40"/>
-            </w:pPr>
-            <w:r>
-              <w:rPr>
-                <w:rFonts w:ascii="Arial" w:cs="Arial" w:eastAsia="Arial" w:hAnsi="Arial"/>
-                <w:color w:val="7F6000"/>
-                <w:sz w:val="20"/>
-                <w:szCs w:val="20"/>
-              </w:rPr>
-              <w:t xml:space="preserve">•  </w:t>
-            </w:r>
-            <w:r>
-              <w:rPr>
-                <w:rFonts w:ascii="Arial" w:cs="Arial" w:eastAsia="Arial" w:hAnsi="Arial"/>
-                <w:sz w:val="20"/>
-                <w:szCs w:val="20"/>
-              </w:rPr>
-              <w:t xml:space="preserve">Gouvernements à fort PMIN ou PGEO pourraient contester</w:t>
-            </w:r>
-          </w:p>
-          <w:p>
-            <w:pPr>
-              <w:spacing w:before="40"/>
-            </w:pPr>
-            <w:r>
-              <w:rPr>
-                <w:rFonts w:ascii="Arial" w:cs="Arial" w:eastAsia="Arial" w:hAnsi="Arial"/>
-                <w:color w:val="7F6000"/>
-                <w:sz w:val="20"/>
-                <w:szCs w:val="20"/>
-              </w:rPr>
-              <w:t xml:space="preserve">•  </w:t>
-            </w:r>
-            <w:r>
-              <w:rPr>
-                <w:rFonts w:ascii="Arial" w:cs="Arial" w:eastAsia="Arial" w:hAnsi="Arial"/>
-                <w:sz w:val="20"/>
-                <w:szCs w:val="20"/>
-              </w:rPr>
-              <w:t xml:space="preserve">Risque de pression politique avant septembre 2027</w:t>
-            </w:r>
-          </w:p>
-          <w:p>
-            <w:pPr>
-              <w:spacing w:before="40"/>
-            </w:pPr>
-            <w:r>
-              <w:rPr>
-                <w:rFonts w:ascii="Arial" w:cs="Arial" w:eastAsia="Arial" w:hAnsi="Arial"/>
-                <w:color w:val="7F6000"/>
-                <w:sz w:val="20"/>
-                <w:szCs w:val="20"/>
-              </w:rPr>
-              <w:t xml:space="preserve">•  </w:t>
-            </w:r>
-            <w:r>
-              <w:rPr>
-                <w:rFonts w:ascii="Arial" w:cs="Arial" w:eastAsia="Arial" w:hAnsi="Arial"/>
-                <w:sz w:val="20"/>
-                <w:szCs w:val="20"/>
-              </w:rPr>
-              <w:t xml:space="preserve">Une pondération différenciée proposée par un membre du Conseil pourrait rouvrir le débat</w:t>
+              <w:top w:type="dxa" w:w="80"/>
+              <w:left w:type="dxa" w:w="120"/>
+              <w:bottom w:type="dxa" w:w="80"/>
+              <w:right w:type="dxa" w:w="120"/>
+            </w:tcMar>
+            <w:vAlign w:val="top"/>
+          </w:tcPr>
+          <w:p>
+            <w:pPr>
+              <w:jc w:val="left"/>
+            </w:pPr>
+            <w:r>
+              <w:rPr>
+                <w:rFonts w:ascii="Arial" w:cs="Arial" w:eastAsia="Arial" w:hAnsi="Arial"/>
+                <w:b/>
+                <w:bCs/>
+                <w:i w:val="false"/>
+                <w:iCs w:val="false"/>
+                <w:color w:val="1F4E79"/>
+                <w:sz w:val="20"/>
+                <w:szCs w:val="20"/>
+              </w:rPr>
+              <w:t xml:space="preserve">WHAT — Quoi</w:t>
+            </w:r>
+          </w:p>
+        </w:tc>
+        <w:tc>
+          <w:tcPr>
+            <w:tcW w:type="dxa" w:w="7560"/>
+            <w:tcBorders>
+              <w:top w:val="single" w:color="CCCCCC" w:sz="1"/>
+              <w:left w:val="single" w:color="CCCCCC" w:sz="1"/>
+              <w:bottom w:val="single" w:color="CCCCCC" w:sz="1"/>
+              <w:right w:val="single" w:color="CCCCCC" w:sz="1"/>
+            </w:tcBorders>
+            <w:tcMar>
+              <w:top w:type="dxa" w:w="80"/>
+              <w:left w:type="dxa" w:w="120"/>
+              <w:bottom w:type="dxa" w:w="80"/>
+              <w:right w:type="dxa" w:w="120"/>
+            </w:tcMar>
+            <w:vAlign w:val="top"/>
+          </w:tcPr>
+          <w:p>
+            <w:pPr>
+              <w:jc w:val="left"/>
+            </w:pPr>
+            <w:r>
+              <w:rPr>
+                <w:rFonts w:ascii="Arial" w:cs="Arial" w:eastAsia="Arial" w:hAnsi="Arial"/>
+                <w:b w:val="false"/>
+                <w:bCs w:val="false"/>
+                <w:i w:val="false"/>
+                <w:iCs w:val="false"/>
+                <w:color w:val="000000"/>
+                <w:sz w:val="20"/>
+                <w:szCs w:val="20"/>
+              </w:rPr>
+              <w:t xml:space="preserve">Approuver formellement l’architecture de pondération sémantique P7B : 5 dimensions de poids par indicateur, valeurs de la table rf.semantic_governance_matrix, robustesse D2 = 0,959.</w:t>
+            </w:r>
+          </w:p>
+        </w:tc>
+      </w:tr>
+      <w:tr>
+        <w:tc>
+          <w:tcPr>
+            <w:tcW w:type="dxa" w:w="1800"/>
+            <w:tcBorders>
+              <w:top w:val="single" w:color="CCCCCC" w:sz="1"/>
+              <w:left w:val="single" w:color="CCCCCC" w:sz="1"/>
+              <w:bottom w:val="single" w:color="CCCCCC" w:sz="1"/>
+              <w:right w:val="single" w:color="CCCCCC" w:sz="1"/>
+            </w:tcBorders>
+            <w:shd w:fill="D6E4F0" w:val="clear"/>
+            <w:tcMar>
+              <w:top w:type="dxa" w:w="80"/>
+              <w:left w:type="dxa" w:w="120"/>
+              <w:bottom w:type="dxa" w:w="80"/>
+              <w:right w:type="dxa" w:w="120"/>
+            </w:tcMar>
+            <w:vAlign w:val="top"/>
+          </w:tcPr>
+          <w:p>
+            <w:pPr>
+              <w:jc w:val="left"/>
+            </w:pPr>
+            <w:r>
+              <w:rPr>
+                <w:rFonts w:ascii="Arial" w:cs="Arial" w:eastAsia="Arial" w:hAnsi="Arial"/>
+                <w:b/>
+                <w:bCs/>
+                <w:i w:val="false"/>
+                <w:iCs w:val="false"/>
+                <w:color w:val="1F4E79"/>
+                <w:sz w:val="20"/>
+                <w:szCs w:val="20"/>
+              </w:rPr>
+              <w:t xml:space="preserve">WHY — Pourquoi</w:t>
+            </w:r>
+          </w:p>
+        </w:tc>
+        <w:tc>
+          <w:tcPr>
+            <w:tcW w:type="dxa" w:w="7560"/>
+            <w:tcBorders>
+              <w:top w:val="single" w:color="CCCCCC" w:sz="1"/>
+              <w:left w:val="single" w:color="CCCCCC" w:sz="1"/>
+              <w:bottom w:val="single" w:color="CCCCCC" w:sz="1"/>
+              <w:right w:val="single" w:color="CCCCCC" w:sz="1"/>
+            </w:tcBorders>
+            <w:tcMar>
+              <w:top w:type="dxa" w:w="80"/>
+              <w:left w:type="dxa" w:w="120"/>
+              <w:bottom w:type="dxa" w:w="80"/>
+              <w:right w:type="dxa" w:w="120"/>
+            </w:tcMar>
+            <w:vAlign w:val="top"/>
+          </w:tcPr>
+          <w:p>
+            <w:pPr>
+              <w:jc w:val="left"/>
+            </w:pPr>
+            <w:r>
+              <w:rPr>
+                <w:rFonts w:ascii="Arial" w:cs="Arial" w:eastAsia="Arial" w:hAnsi="Arial"/>
+                <w:b w:val="false"/>
+                <w:bCs w:val="false"/>
+                <w:i w:val="false"/>
+                <w:iCs w:val="false"/>
+                <w:color w:val="000000"/>
+                <w:sz w:val="20"/>
+                <w:szCs w:val="20"/>
+              </w:rPr>
+              <w:t xml:space="preserve">Sans ce vote, le Conseil certifie les scores ISA sans avoir validé le mécanisme qui calcule les scores au sein de chaque pilier. La chaîne de validation doit être complète pour être opposable à toute contestation académique.</w:t>
+            </w:r>
+          </w:p>
+        </w:tc>
+      </w:tr>
+      <w:tr>
+        <w:tc>
+          <w:tcPr>
+            <w:tcW w:type="dxa" w:w="1800"/>
+            <w:tcBorders>
+              <w:top w:val="single" w:color="CCCCCC" w:sz="1"/>
+              <w:left w:val="single" w:color="CCCCCC" w:sz="1"/>
+              <w:bottom w:val="single" w:color="CCCCCC" w:sz="1"/>
+              <w:right w:val="single" w:color="CCCCCC" w:sz="1"/>
+            </w:tcBorders>
+            <w:shd w:fill="D6E4F0" w:val="clear"/>
+            <w:tcMar>
+              <w:top w:type="dxa" w:w="80"/>
+              <w:left w:type="dxa" w:w="120"/>
+              <w:bottom w:type="dxa" w:w="80"/>
+              <w:right w:type="dxa" w:w="120"/>
+            </w:tcMar>
+            <w:vAlign w:val="top"/>
+          </w:tcPr>
+          <w:p>
+            <w:pPr>
+              <w:jc w:val="left"/>
+            </w:pPr>
+            <w:r>
+              <w:rPr>
+                <w:rFonts w:ascii="Arial" w:cs="Arial" w:eastAsia="Arial" w:hAnsi="Arial"/>
+                <w:b/>
+                <w:bCs/>
+                <w:i w:val="false"/>
+                <w:iCs w:val="false"/>
+                <w:color w:val="1F4E79"/>
+                <w:sz w:val="20"/>
+                <w:szCs w:val="20"/>
+              </w:rPr>
+              <w:t xml:space="preserve">HOW — Comment</w:t>
+            </w:r>
+          </w:p>
+        </w:tc>
+        <w:tc>
+          <w:tcPr>
+            <w:tcW w:type="dxa" w:w="7560"/>
+            <w:tcBorders>
+              <w:top w:val="single" w:color="CCCCCC" w:sz="1"/>
+              <w:left w:val="single" w:color="CCCCCC" w:sz="1"/>
+              <w:bottom w:val="single" w:color="CCCCCC" w:sz="1"/>
+              <w:right w:val="single" w:color="CCCCCC" w:sz="1"/>
+            </w:tcBorders>
+            <w:tcMar>
+              <w:top w:type="dxa" w:w="80"/>
+              <w:left w:type="dxa" w:w="120"/>
+              <w:bottom w:type="dxa" w:w="80"/>
+              <w:right w:type="dxa" w:w="120"/>
+            </w:tcMar>
+            <w:vAlign w:val="top"/>
+          </w:tcPr>
+          <w:p>
+            <w:pPr>
+              <w:jc w:val="left"/>
+            </w:pPr>
+            <w:r>
+              <w:rPr>
+                <w:rFonts w:ascii="Arial" w:cs="Arial" w:eastAsia="Arial" w:hAnsi="Arial"/>
+                <w:b w:val="false"/>
+                <w:bCs w:val="false"/>
+                <w:i w:val="false"/>
+                <w:iCs w:val="false"/>
+                <w:color w:val="000000"/>
+                <w:sz w:val="20"/>
+                <w:szCs w:val="20"/>
+              </w:rPr>
+              <w:t xml:space="preserve">Présentation P7B (13 codes sémantiques, 5 dimensions, valeurs sovereignty_weight). Présentation D2 Monte Carlo. Questions des membres. Vote de validation.</w:t>
+            </w:r>
+          </w:p>
+        </w:tc>
+      </w:tr>
+      <w:tr>
+        <w:tc>
+          <w:tcPr>
+            <w:tcW w:type="dxa" w:w="1800"/>
+            <w:tcBorders>
+              <w:top w:val="single" w:color="CCCCCC" w:sz="1"/>
+              <w:left w:val="single" w:color="CCCCCC" w:sz="1"/>
+              <w:bottom w:val="single" w:color="CCCCCC" w:sz="1"/>
+              <w:right w:val="single" w:color="CCCCCC" w:sz="1"/>
+            </w:tcBorders>
+            <w:shd w:fill="D6E4F0" w:val="clear"/>
+            <w:tcMar>
+              <w:top w:type="dxa" w:w="80"/>
+              <w:left w:type="dxa" w:w="120"/>
+              <w:bottom w:type="dxa" w:w="80"/>
+              <w:right w:type="dxa" w:w="120"/>
+            </w:tcMar>
+            <w:vAlign w:val="top"/>
+          </w:tcPr>
+          <w:p>
+            <w:pPr>
+              <w:jc w:val="left"/>
+            </w:pPr>
+            <w:r>
+              <w:rPr>
+                <w:rFonts w:ascii="Arial" w:cs="Arial" w:eastAsia="Arial" w:hAnsi="Arial"/>
+                <w:b/>
+                <w:bCs/>
+                <w:i w:val="false"/>
+                <w:iCs w:val="false"/>
+                <w:color w:val="1F4E79"/>
+                <w:sz w:val="20"/>
+                <w:szCs w:val="20"/>
+              </w:rPr>
+              <w:t xml:space="preserve">Règle de vote</w:t>
+            </w:r>
+          </w:p>
+        </w:tc>
+        <w:tc>
+          <w:tcPr>
+            <w:tcW w:type="dxa" w:w="7560"/>
+            <w:tcBorders>
+              <w:top w:val="single" w:color="CCCCCC" w:sz="1"/>
+              <w:left w:val="single" w:color="CCCCCC" w:sz="1"/>
+              <w:bottom w:val="single" w:color="CCCCCC" w:sz="1"/>
+              <w:right w:val="single" w:color="CCCCCC" w:sz="1"/>
+            </w:tcBorders>
+            <w:tcMar>
+              <w:top w:type="dxa" w:w="80"/>
+              <w:left w:type="dxa" w:w="120"/>
+              <w:bottom w:type="dxa" w:w="80"/>
+              <w:right w:type="dxa" w:w="120"/>
+            </w:tcMar>
+            <w:vAlign w:val="top"/>
+          </w:tcPr>
+          <w:p>
+            <w:pPr>
+              <w:jc w:val="left"/>
+            </w:pPr>
+            <w:r>
+              <w:rPr>
+                <w:rFonts w:ascii="Arial" w:cs="Arial" w:eastAsia="Arial" w:hAnsi="Arial"/>
+                <w:b w:val="false"/>
+                <w:bCs w:val="false"/>
+                <w:i w:val="false"/>
+                <w:iCs w:val="false"/>
+                <w:color w:val="000000"/>
+                <w:sz w:val="20"/>
+                <w:szCs w:val="20"/>
+              </w:rPr>
+              <w:t xml:space="preserve">Majorité simple 4/5 — Quorum 5/7. Nature : validation d’une décision technique, pas décision de gouvernance.</w:t>
+            </w:r>
+          </w:p>
+        </w:tc>
+      </w:tr>
+    </w:tbl>
+    <w:p>
+      <w:pPr>
+        <w:spacing w:after="100" w:before="100"/>
+      </w:pPr>
+      <w:r>
+        <w:t xml:space="preserve"/>
+      </w:r>
+    </w:p>
+    <w:tbl>
+      <w:tblPr>
+        <w:tblW w:type="dxa" w:w="9360"/>
+        <w:tblBorders>
+          <w:top w:val="single" w:color="auto" w:sz="4"/>
+          <w:left w:val="single" w:color="auto" w:sz="4"/>
+          <w:bottom w:val="single" w:color="auto" w:sz="4"/>
+          <w:right w:val="single" w:color="auto" w:sz="4"/>
+          <w:insideH w:val="single" w:color="auto" w:sz="4"/>
+          <w:insideV w:val="single" w:color="auto" w:sz="4"/>
+        </w:tblBorders>
+      </w:tblPr>
+      <w:tblGrid>
+        <w:gridCol w:w="3000"/>
+        <w:gridCol w:w="6360"/>
+      </w:tblGrid>
+      <w:tr>
+        <w:tc>
+          <w:tcPr>
+            <w:tcW w:type="dxa" w:w="3000"/>
+            <w:tcBorders>
+              <w:top w:val="single" w:color="CCCCCC" w:sz="1"/>
+              <w:left w:val="single" w:color="CCCCCC" w:sz="1"/>
+              <w:bottom w:val="single" w:color="CCCCCC" w:sz="1"/>
+              <w:right w:val="single" w:color="CCCCCC" w:sz="1"/>
+            </w:tcBorders>
+            <w:shd w:fill="1F4E79" w:val="clear"/>
+            <w:tcMar>
+              <w:top w:type="dxa" w:w="80"/>
+              <w:left w:type="dxa" w:w="120"/>
+              <w:bottom w:type="dxa" w:w="80"/>
+              <w:right w:type="dxa" w:w="120"/>
+            </w:tcMar>
+            <w:vAlign w:val="top"/>
+          </w:tcPr>
+          <w:p>
+            <w:pPr>
+              <w:jc w:val="left"/>
+            </w:pPr>
+            <w:r>
+              <w:rPr>
+                <w:rFonts w:ascii="Arial" w:cs="Arial" w:eastAsia="Arial" w:hAnsi="Arial"/>
+                <w:b/>
+                <w:bCs/>
+                <w:i w:val="false"/>
+                <w:iCs w:val="false"/>
+                <w:color w:val="FFFFFF"/>
+                <w:sz w:val="20"/>
+                <w:szCs w:val="20"/>
+              </w:rPr>
+              <w:t xml:space="preserve">Code sémantique P7B</w:t>
+            </w:r>
+          </w:p>
+        </w:tc>
+        <w:tc>
+          <w:tcPr>
+            <w:tcW w:type="dxa" w:w="6360"/>
+            <w:tcBorders>
+              <w:top w:val="single" w:color="CCCCCC" w:sz="1"/>
+              <w:left w:val="single" w:color="CCCCCC" w:sz="1"/>
+              <w:bottom w:val="single" w:color="CCCCCC" w:sz="1"/>
+              <w:right w:val="single" w:color="CCCCCC" w:sz="1"/>
+            </w:tcBorders>
+            <w:shd w:fill="1F4E79" w:val="clear"/>
+            <w:tcMar>
+              <w:top w:type="dxa" w:w="80"/>
+              <w:left w:type="dxa" w:w="120"/>
+              <w:bottom w:type="dxa" w:w="80"/>
+              <w:right w:type="dxa" w:w="120"/>
+            </w:tcMar>
+            <w:vAlign w:val="top"/>
+          </w:tcPr>
+          <w:p>
+            <w:pPr>
+              <w:jc w:val="left"/>
+            </w:pPr>
+            <w:r>
+              <w:rPr>
+                <w:rFonts w:ascii="Arial" w:cs="Arial" w:eastAsia="Arial" w:hAnsi="Arial"/>
+                <w:b/>
+                <w:bCs/>
+                <w:i w:val="false"/>
+                <w:iCs w:val="false"/>
+                <w:color w:val="FFFFFF"/>
+                <w:sz w:val="20"/>
+                <w:szCs w:val="20"/>
+              </w:rPr>
+              <w:t xml:space="preserve">Sovereignty weight — justification doctrinale</w:t>
+            </w:r>
+          </w:p>
+        </w:tc>
+      </w:tr>
+      <w:tr>
+        <w:tc>
+          <w:tcPr>
+            <w:tcW w:type="dxa" w:w="3000"/>
+            <w:tcBorders>
+              <w:top w:val="single" w:color="CCCCCC" w:sz="1"/>
+              <w:left w:val="single" w:color="CCCCCC" w:sz="1"/>
+              <w:bottom w:val="single" w:color="CCCCCC" w:sz="1"/>
+              <w:right w:val="single" w:color="CCCCCC" w:sz="1"/>
+            </w:tcBorders>
+            <w:shd w:fill="D6E4F0" w:val="clear"/>
+            <w:tcMar>
+              <w:top w:type="dxa" w:w="80"/>
+              <w:left w:type="dxa" w:w="120"/>
+              <w:bottom w:type="dxa" w:w="80"/>
+              <w:right w:type="dxa" w:w="120"/>
+            </w:tcMar>
+            <w:vAlign w:val="top"/>
+          </w:tcPr>
+          <w:p>
+            <w:pPr>
+              <w:jc w:val="left"/>
+            </w:pPr>
+            <w:r>
+              <w:rPr>
+                <w:rFonts w:ascii="Arial" w:cs="Arial" w:eastAsia="Arial" w:hAnsi="Arial"/>
+                <w:b/>
+                <w:bCs/>
+                <w:i w:val="false"/>
+                <w:iCs w:val="false"/>
+                <w:color w:val="1F4E79"/>
+                <w:sz w:val="20"/>
+                <w:szCs w:val="20"/>
+              </w:rPr>
+              <w:t xml:space="preserve">PHYSICAL</w:t>
+            </w:r>
+          </w:p>
+        </w:tc>
+        <w:tc>
+          <w:tcPr>
+            <w:tcW w:type="dxa" w:w="6360"/>
+            <w:tcBorders>
+              <w:top w:val="single" w:color="CCCCCC" w:sz="1"/>
+              <w:left w:val="single" w:color="CCCCCC" w:sz="1"/>
+              <w:bottom w:val="single" w:color="CCCCCC" w:sz="1"/>
+              <w:right w:val="single" w:color="CCCCCC" w:sz="1"/>
+            </w:tcBorders>
+            <w:tcMar>
+              <w:top w:type="dxa" w:w="80"/>
+              <w:left w:type="dxa" w:w="120"/>
+              <w:bottom w:type="dxa" w:w="80"/>
+              <w:right w:type="dxa" w:w="120"/>
+            </w:tcMar>
+            <w:vAlign w:val="top"/>
+          </w:tcPr>
+          <w:p>
+            <w:pPr>
+              <w:jc w:val="left"/>
+            </w:pPr>
+            <w:r>
+              <w:rPr>
+                <w:rFonts w:ascii="Arial" w:cs="Arial" w:eastAsia="Arial" w:hAnsi="Arial"/>
+                <w:b w:val="false"/>
+                <w:bCs w:val="false"/>
+                <w:i w:val="false"/>
+                <w:iCs w:val="false"/>
+                <w:color w:val="000000"/>
+                <w:sz w:val="20"/>
+                <w:szCs w:val="20"/>
+              </w:rPr>
+              <w:t xml:space="preserve">0,950 — Données physiques observables directement (production, infrastructure, capacité)</w:t>
+            </w:r>
+          </w:p>
+        </w:tc>
+      </w:tr>
+      <w:tr>
+        <w:tc>
+          <w:tcPr>
+            <w:tcW w:type="dxa" w:w="3000"/>
+            <w:tcBorders>
+              <w:top w:val="single" w:color="CCCCCC" w:sz="1"/>
+              <w:left w:val="single" w:color="CCCCCC" w:sz="1"/>
+              <w:bottom w:val="single" w:color="CCCCCC" w:sz="1"/>
+              <w:right w:val="single" w:color="CCCCCC" w:sz="1"/>
+            </w:tcBorders>
+            <w:shd w:fill="D6E4F0" w:val="clear"/>
+            <w:tcMar>
+              <w:top w:type="dxa" w:w="80"/>
+              <w:left w:type="dxa" w:w="120"/>
+              <w:bottom w:type="dxa" w:w="80"/>
+              <w:right w:type="dxa" w:w="120"/>
+            </w:tcMar>
+            <w:vAlign w:val="top"/>
+          </w:tcPr>
+          <w:p>
+            <w:pPr>
+              <w:jc w:val="left"/>
+            </w:pPr>
+            <w:r>
+              <w:rPr>
+                <w:rFonts w:ascii="Arial" w:cs="Arial" w:eastAsia="Arial" w:hAnsi="Arial"/>
+                <w:b/>
+                <w:bCs/>
+                <w:i w:val="false"/>
+                <w:iCs w:val="false"/>
+                <w:color w:val="1F4E79"/>
+                <w:sz w:val="20"/>
+                <w:szCs w:val="20"/>
+              </w:rPr>
+              <w:t xml:space="preserve">STOCK</w:t>
+            </w:r>
+          </w:p>
+        </w:tc>
+        <w:tc>
+          <w:tcPr>
+            <w:tcW w:type="dxa" w:w="6360"/>
+            <w:tcBorders>
+              <w:top w:val="single" w:color="CCCCCC" w:sz="1"/>
+              <w:left w:val="single" w:color="CCCCCC" w:sz="1"/>
+              <w:bottom w:val="single" w:color="CCCCCC" w:sz="1"/>
+              <w:right w:val="single" w:color="CCCCCC" w:sz="1"/>
+            </w:tcBorders>
+            <w:tcMar>
+              <w:top w:type="dxa" w:w="80"/>
+              <w:left w:type="dxa" w:w="120"/>
+              <w:bottom w:type="dxa" w:w="80"/>
+              <w:right w:type="dxa" w:w="120"/>
+            </w:tcMar>
+            <w:vAlign w:val="top"/>
+          </w:tcPr>
+          <w:p>
+            <w:pPr>
+              <w:jc w:val="left"/>
+            </w:pPr>
+            <w:r>
+              <w:rPr>
+                <w:rFonts w:ascii="Arial" w:cs="Arial" w:eastAsia="Arial" w:hAnsi="Arial"/>
+                <w:b w:val="false"/>
+                <w:bCs w:val="false"/>
+                <w:i w:val="false"/>
+                <w:iCs w:val="false"/>
+                <w:color w:val="000000"/>
+                <w:sz w:val="20"/>
+                <w:szCs w:val="20"/>
+              </w:rPr>
+              <w:t xml:space="preserve">0,900 — Stocks de ressources souveraines (réserves, capital, dotations)</w:t>
+            </w:r>
+          </w:p>
+        </w:tc>
+      </w:tr>
+      <w:tr>
+        <w:tc>
+          <w:tcPr>
+            <w:tcW w:type="dxa" w:w="3000"/>
+            <w:tcBorders>
+              <w:top w:val="single" w:color="CCCCCC" w:sz="1"/>
+              <w:left w:val="single" w:color="CCCCCC" w:sz="1"/>
+              <w:bottom w:val="single" w:color="CCCCCC" w:sz="1"/>
+              <w:right w:val="single" w:color="CCCCCC" w:sz="1"/>
+            </w:tcBorders>
+            <w:shd w:fill="D6E4F0" w:val="clear"/>
+            <w:tcMar>
+              <w:top w:type="dxa" w:w="80"/>
+              <w:left w:type="dxa" w:w="120"/>
+              <w:bottom w:type="dxa" w:w="80"/>
+              <w:right w:type="dxa" w:w="120"/>
+            </w:tcMar>
+            <w:vAlign w:val="top"/>
+          </w:tcPr>
+          <w:p>
+            <w:pPr>
+              <w:jc w:val="left"/>
+            </w:pPr>
+            <w:r>
+              <w:rPr>
+                <w:rFonts w:ascii="Arial" w:cs="Arial" w:eastAsia="Arial" w:hAnsi="Arial"/>
+                <w:b/>
+                <w:bCs/>
+                <w:i w:val="false"/>
+                <w:iCs w:val="false"/>
+                <w:color w:val="1F4E79"/>
+                <w:sz w:val="20"/>
+                <w:szCs w:val="20"/>
+              </w:rPr>
+              <w:t xml:space="preserve">STRUCTURAL</w:t>
+            </w:r>
+          </w:p>
+        </w:tc>
+        <w:tc>
+          <w:tcPr>
+            <w:tcW w:type="dxa" w:w="6360"/>
+            <w:tcBorders>
+              <w:top w:val="single" w:color="CCCCCC" w:sz="1"/>
+              <w:left w:val="single" w:color="CCCCCC" w:sz="1"/>
+              <w:bottom w:val="single" w:color="CCCCCC" w:sz="1"/>
+              <w:right w:val="single" w:color="CCCCCC" w:sz="1"/>
+            </w:tcBorders>
+            <w:tcMar>
+              <w:top w:type="dxa" w:w="80"/>
+              <w:left w:type="dxa" w:w="120"/>
+              <w:bottom w:type="dxa" w:w="80"/>
+              <w:right w:type="dxa" w:w="120"/>
+            </w:tcMar>
+            <w:vAlign w:val="top"/>
+          </w:tcPr>
+          <w:p>
+            <w:pPr>
+              <w:jc w:val="left"/>
+            </w:pPr>
+            <w:r>
+              <w:rPr>
+                <w:rFonts w:ascii="Arial" w:cs="Arial" w:eastAsia="Arial" w:hAnsi="Arial"/>
+                <w:b w:val="false"/>
+                <w:bCs w:val="false"/>
+                <w:i w:val="false"/>
+                <w:iCs w:val="false"/>
+                <w:color w:val="000000"/>
+                <w:sz w:val="20"/>
+                <w:szCs w:val="20"/>
+              </w:rPr>
+              <w:t xml:space="preserve">0,850 — Structures institutionnelles et organisationnelles</w:t>
+            </w:r>
+          </w:p>
+        </w:tc>
+      </w:tr>
+      <w:tr>
+        <w:tc>
+          <w:tcPr>
+            <w:tcW w:type="dxa" w:w="3000"/>
+            <w:tcBorders>
+              <w:top w:val="single" w:color="CCCCCC" w:sz="1"/>
+              <w:left w:val="single" w:color="CCCCCC" w:sz="1"/>
+              <w:bottom w:val="single" w:color="CCCCCC" w:sz="1"/>
+              <w:right w:val="single" w:color="CCCCCC" w:sz="1"/>
+            </w:tcBorders>
+            <w:shd w:fill="D6E4F0" w:val="clear"/>
+            <w:tcMar>
+              <w:top w:type="dxa" w:w="80"/>
+              <w:left w:type="dxa" w:w="120"/>
+              <w:bottom w:type="dxa" w:w="80"/>
+              <w:right w:type="dxa" w:w="120"/>
+            </w:tcMar>
+            <w:vAlign w:val="top"/>
+          </w:tcPr>
+          <w:p>
+            <w:pPr>
+              <w:jc w:val="left"/>
+            </w:pPr>
+            <w:r>
+              <w:rPr>
+                <w:rFonts w:ascii="Arial" w:cs="Arial" w:eastAsia="Arial" w:hAnsi="Arial"/>
+                <w:b/>
+                <w:bCs/>
+                <w:i w:val="false"/>
+                <w:iCs w:val="false"/>
+                <w:color w:val="1F4E79"/>
+                <w:sz w:val="20"/>
+                <w:szCs w:val="20"/>
+              </w:rPr>
+              <w:t xml:space="preserve">GOVERNANCE</w:t>
+            </w:r>
+          </w:p>
+        </w:tc>
+        <w:tc>
+          <w:tcPr>
+            <w:tcW w:type="dxa" w:w="6360"/>
+            <w:tcBorders>
+              <w:top w:val="single" w:color="CCCCCC" w:sz="1"/>
+              <w:left w:val="single" w:color="CCCCCC" w:sz="1"/>
+              <w:bottom w:val="single" w:color="CCCCCC" w:sz="1"/>
+              <w:right w:val="single" w:color="CCCCCC" w:sz="1"/>
+            </w:tcBorders>
+            <w:tcMar>
+              <w:top w:type="dxa" w:w="80"/>
+              <w:left w:type="dxa" w:w="120"/>
+              <w:bottom w:type="dxa" w:w="80"/>
+              <w:right w:type="dxa" w:w="120"/>
+            </w:tcMar>
+            <w:vAlign w:val="top"/>
+          </w:tcPr>
+          <w:p>
+            <w:pPr>
+              <w:jc w:val="left"/>
+            </w:pPr>
+            <w:r>
+              <w:rPr>
+                <w:rFonts w:ascii="Arial" w:cs="Arial" w:eastAsia="Arial" w:hAnsi="Arial"/>
+                <w:b w:val="false"/>
+                <w:bCs w:val="false"/>
+                <w:i w:val="false"/>
+                <w:iCs w:val="false"/>
+                <w:color w:val="000000"/>
+                <w:sz w:val="20"/>
+                <w:szCs w:val="20"/>
+              </w:rPr>
+              <w:t xml:space="preserve">0,830 — Gouvernance déclarée et auditée (EITI, sources N1)</w:t>
+            </w:r>
+          </w:p>
+        </w:tc>
+      </w:tr>
+      <w:tr>
+        <w:tc>
+          <w:tcPr>
+            <w:tcW w:type="dxa" w:w="3000"/>
+            <w:tcBorders>
+              <w:top w:val="single" w:color="CCCCCC" w:sz="1"/>
+              <w:left w:val="single" w:color="CCCCCC" w:sz="1"/>
+              <w:bottom w:val="single" w:color="CCCCCC" w:sz="1"/>
+              <w:right w:val="single" w:color="CCCCCC" w:sz="1"/>
+            </w:tcBorders>
+            <w:shd w:fill="D6E4F0" w:val="clear"/>
+            <w:tcMar>
+              <w:top w:type="dxa" w:w="80"/>
+              <w:left w:type="dxa" w:w="120"/>
+              <w:bottom w:type="dxa" w:w="80"/>
+              <w:right w:type="dxa" w:w="120"/>
+            </w:tcMar>
+            <w:vAlign w:val="top"/>
+          </w:tcPr>
+          <w:p>
+            <w:pPr>
+              <w:jc w:val="left"/>
+            </w:pPr>
+            <w:r>
+              <w:rPr>
+                <w:rFonts w:ascii="Arial" w:cs="Arial" w:eastAsia="Arial" w:hAnsi="Arial"/>
+                <w:b/>
+                <w:bCs/>
+                <w:i w:val="false"/>
+                <w:iCs w:val="false"/>
+                <w:color w:val="1F4E79"/>
+                <w:sz w:val="20"/>
+                <w:szCs w:val="20"/>
+              </w:rPr>
+              <w:t xml:space="preserve">NETWORK</w:t>
+            </w:r>
+          </w:p>
+        </w:tc>
+        <w:tc>
+          <w:tcPr>
+            <w:tcW w:type="dxa" w:w="6360"/>
+            <w:tcBorders>
+              <w:top w:val="single" w:color="CCCCCC" w:sz="1"/>
+              <w:left w:val="single" w:color="CCCCCC" w:sz="1"/>
+              <w:bottom w:val="single" w:color="CCCCCC" w:sz="1"/>
+              <w:right w:val="single" w:color="CCCCCC" w:sz="1"/>
+            </w:tcBorders>
+            <w:tcMar>
+              <w:top w:type="dxa" w:w="80"/>
+              <w:left w:type="dxa" w:w="120"/>
+              <w:bottom w:type="dxa" w:w="80"/>
+              <w:right w:type="dxa" w:w="120"/>
+            </w:tcMar>
+            <w:vAlign w:val="top"/>
+          </w:tcPr>
+          <w:p>
+            <w:pPr>
+              <w:jc w:val="left"/>
+            </w:pPr>
+            <w:r>
+              <w:rPr>
+                <w:rFonts w:ascii="Arial" w:cs="Arial" w:eastAsia="Arial" w:hAnsi="Arial"/>
+                <w:b w:val="false"/>
+                <w:bCs w:val="false"/>
+                <w:i w:val="false"/>
+                <w:iCs w:val="false"/>
+                <w:color w:val="000000"/>
+                <w:sz w:val="20"/>
+                <w:szCs w:val="20"/>
+              </w:rPr>
+              <w:t xml:space="preserve">0,730 — Connectivité, intégration régionale et diplomatique</w:t>
             </w:r>
           </w:p>
         </w:tc>
@@ -2058,7 +2579,881 @@
           <w:sz w:val="26"/>
           <w:szCs w:val="26"/>
         </w:rPr>
-        <w:t xml:space="preserve">Modalité d’intervention du Conseil</w:t>
+        <w:t xml:space="preserve">Vote V1 — Certification de la pondération égale des piliers (Niveau 1)</w:t>
+      </w:r>
+    </w:p>
+    <w:tbl>
+      <w:tblPr>
+        <w:tblW w:type="dxa" w:w="9360"/>
+        <w:tblBorders>
+          <w:top w:val="single" w:color="auto" w:sz="4"/>
+          <w:left w:val="single" w:color="auto" w:sz="4"/>
+          <w:bottom w:val="single" w:color="auto" w:sz="4"/>
+          <w:right w:val="single" w:color="auto" w:sz="4"/>
+          <w:insideH w:val="single" w:color="auto" w:sz="4"/>
+          <w:insideV w:val="single" w:color="auto" w:sz="4"/>
+        </w:tblBorders>
+      </w:tblPr>
+      <w:tblGrid>
+        <w:gridCol w:w="1800"/>
+        <w:gridCol w:w="7560"/>
+      </w:tblGrid>
+      <w:tr>
+        <w:tc>
+          <w:tcPr>
+            <w:tcW w:type="dxa" w:w="1800"/>
+            <w:tcBorders>
+              <w:top w:val="single" w:color="CCCCCC" w:sz="1"/>
+              <w:left w:val="single" w:color="CCCCCC" w:sz="1"/>
+              <w:bottom w:val="single" w:color="CCCCCC" w:sz="1"/>
+              <w:right w:val="single" w:color="CCCCCC" w:sz="1"/>
+            </w:tcBorders>
+            <w:shd w:fill="1F4E79" w:val="clear"/>
+            <w:tcMar>
+              <w:top w:type="dxa" w:w="80"/>
+              <w:left w:type="dxa" w:w="120"/>
+              <w:bottom w:type="dxa" w:w="80"/>
+              <w:right w:type="dxa" w:w="120"/>
+            </w:tcMar>
+            <w:vAlign w:val="top"/>
+          </w:tcPr>
+          <w:p>
+            <w:pPr>
+              <w:jc w:val="left"/>
+            </w:pPr>
+            <w:r>
+              <w:rPr>
+                <w:rFonts w:ascii="Arial" w:cs="Arial" w:eastAsia="Arial" w:hAnsi="Arial"/>
+                <w:b/>
+                <w:bCs/>
+                <w:i w:val="false"/>
+                <w:iCs w:val="false"/>
+                <w:color w:val="FFFFFF"/>
+                <w:sz w:val="20"/>
+                <w:szCs w:val="20"/>
+              </w:rPr>
+              <w:t xml:space="preserve">Dimension</w:t>
+            </w:r>
+          </w:p>
+        </w:tc>
+        <w:tc>
+          <w:tcPr>
+            <w:tcW w:type="dxa" w:w="7560"/>
+            <w:tcBorders>
+              <w:top w:val="single" w:color="CCCCCC" w:sz="1"/>
+              <w:left w:val="single" w:color="CCCCCC" w:sz="1"/>
+              <w:bottom w:val="single" w:color="CCCCCC" w:sz="1"/>
+              <w:right w:val="single" w:color="CCCCCC" w:sz="1"/>
+            </w:tcBorders>
+            <w:shd w:fill="1F4E79" w:val="clear"/>
+            <w:tcMar>
+              <w:top w:type="dxa" w:w="80"/>
+              <w:left w:type="dxa" w:w="120"/>
+              <w:bottom w:type="dxa" w:w="80"/>
+              <w:right w:type="dxa" w:w="120"/>
+            </w:tcMar>
+            <w:vAlign w:val="top"/>
+          </w:tcPr>
+          <w:p>
+            <w:pPr>
+              <w:jc w:val="left"/>
+            </w:pPr>
+            <w:r>
+              <w:rPr>
+                <w:rFonts w:ascii="Arial" w:cs="Arial" w:eastAsia="Arial" w:hAnsi="Arial"/>
+                <w:b/>
+                <w:bCs/>
+                <w:i w:val="false"/>
+                <w:iCs w:val="false"/>
+                <w:color w:val="FFFFFF"/>
+                <w:sz w:val="20"/>
+                <w:szCs w:val="20"/>
+              </w:rPr>
+              <w:t xml:space="preserve">Contenu de la présentation au Conseil</w:t>
+            </w:r>
+          </w:p>
+        </w:tc>
+      </w:tr>
+      <w:tr>
+        <w:tc>
+          <w:tcPr>
+            <w:tcW w:type="dxa" w:w="1800"/>
+            <w:tcBorders>
+              <w:top w:val="single" w:color="CCCCCC" w:sz="1"/>
+              <w:left w:val="single" w:color="CCCCCC" w:sz="1"/>
+              <w:bottom w:val="single" w:color="CCCCCC" w:sz="1"/>
+              <w:right w:val="single" w:color="CCCCCC" w:sz="1"/>
+            </w:tcBorders>
+            <w:shd w:fill="D6E4F0" w:val="clear"/>
+            <w:tcMar>
+              <w:top w:type="dxa" w:w="80"/>
+              <w:left w:type="dxa" w:w="120"/>
+              <w:bottom w:type="dxa" w:w="80"/>
+              <w:right w:type="dxa" w:w="120"/>
+            </w:tcMar>
+            <w:vAlign w:val="top"/>
+          </w:tcPr>
+          <w:p>
+            <w:pPr>
+              <w:jc w:val="left"/>
+            </w:pPr>
+            <w:r>
+              <w:rPr>
+                <w:rFonts w:ascii="Arial" w:cs="Arial" w:eastAsia="Arial" w:hAnsi="Arial"/>
+                <w:b/>
+                <w:bCs/>
+                <w:i w:val="false"/>
+                <w:iCs w:val="false"/>
+                <w:color w:val="1F4E79"/>
+                <w:sz w:val="20"/>
+                <w:szCs w:val="20"/>
+              </w:rPr>
+              <w:t xml:space="preserve">WHAT — Quoi</w:t>
+            </w:r>
+          </w:p>
+        </w:tc>
+        <w:tc>
+          <w:tcPr>
+            <w:tcW w:type="dxa" w:w="7560"/>
+            <w:tcBorders>
+              <w:top w:val="single" w:color="CCCCCC" w:sz="1"/>
+              <w:left w:val="single" w:color="CCCCCC" w:sz="1"/>
+              <w:bottom w:val="single" w:color="CCCCCC" w:sz="1"/>
+              <w:right w:val="single" w:color="CCCCCC" w:sz="1"/>
+            </w:tcBorders>
+            <w:tcMar>
+              <w:top w:type="dxa" w:w="80"/>
+              <w:left w:type="dxa" w:w="120"/>
+              <w:bottom w:type="dxa" w:w="80"/>
+              <w:right w:type="dxa" w:w="120"/>
+            </w:tcMar>
+            <w:vAlign w:val="top"/>
+          </w:tcPr>
+          <w:p>
+            <w:pPr>
+              <w:jc w:val="left"/>
+            </w:pPr>
+            <w:r>
+              <w:rPr>
+                <w:rFonts w:ascii="Arial" w:cs="Arial" w:eastAsia="Arial" w:hAnsi="Arial"/>
+                <w:b w:val="false"/>
+                <w:bCs w:val="false"/>
+                <w:i w:val="false"/>
+                <w:iCs w:val="false"/>
+                <w:color w:val="000000"/>
+                <w:sz w:val="20"/>
+                <w:szCs w:val="20"/>
+              </w:rPr>
+              <w:t xml:space="preserve">Certifier formellement que la pondération égale (0,10 par pilier) est la référence méthodologique officielle pour la publication ISA de septembre 2027.</w:t>
+            </w:r>
+          </w:p>
+        </w:tc>
+      </w:tr>
+      <w:tr>
+        <w:tc>
+          <w:tcPr>
+            <w:tcW w:type="dxa" w:w="1800"/>
+            <w:tcBorders>
+              <w:top w:val="single" w:color="CCCCCC" w:sz="1"/>
+              <w:left w:val="single" w:color="CCCCCC" w:sz="1"/>
+              <w:bottom w:val="single" w:color="CCCCCC" w:sz="1"/>
+              <w:right w:val="single" w:color="CCCCCC" w:sz="1"/>
+            </w:tcBorders>
+            <w:shd w:fill="D6E4F0" w:val="clear"/>
+            <w:tcMar>
+              <w:top w:type="dxa" w:w="80"/>
+              <w:left w:type="dxa" w:w="120"/>
+              <w:bottom w:type="dxa" w:w="80"/>
+              <w:right w:type="dxa" w:w="120"/>
+            </w:tcMar>
+            <w:vAlign w:val="top"/>
+          </w:tcPr>
+          <w:p>
+            <w:pPr>
+              <w:jc w:val="left"/>
+            </w:pPr>
+            <w:r>
+              <w:rPr>
+                <w:rFonts w:ascii="Arial" w:cs="Arial" w:eastAsia="Arial" w:hAnsi="Arial"/>
+                <w:b/>
+                <w:bCs/>
+                <w:i w:val="false"/>
+                <w:iCs w:val="false"/>
+                <w:color w:val="1F4E79"/>
+                <w:sz w:val="20"/>
+                <w:szCs w:val="20"/>
+              </w:rPr>
+              <w:t xml:space="preserve">WHY — Pourquoi</w:t>
+            </w:r>
+          </w:p>
+        </w:tc>
+        <w:tc>
+          <w:tcPr>
+            <w:tcW w:type="dxa" w:w="7560"/>
+            <w:tcBorders>
+              <w:top w:val="single" w:color="CCCCCC" w:sz="1"/>
+              <w:left w:val="single" w:color="CCCCCC" w:sz="1"/>
+              <w:bottom w:val="single" w:color="CCCCCC" w:sz="1"/>
+              <w:right w:val="single" w:color="CCCCCC" w:sz="1"/>
+            </w:tcBorders>
+            <w:tcMar>
+              <w:top w:type="dxa" w:w="80"/>
+              <w:left w:type="dxa" w:w="120"/>
+              <w:bottom w:type="dxa" w:w="80"/>
+              <w:right w:type="dxa" w:w="120"/>
+            </w:tcMar>
+            <w:vAlign w:val="top"/>
+          </w:tcPr>
+          <w:p>
+            <w:pPr>
+              <w:jc w:val="left"/>
+            </w:pPr>
+            <w:r>
+              <w:rPr>
+                <w:rFonts w:ascii="Arial" w:cs="Arial" w:eastAsia="Arial" w:hAnsi="Arial"/>
+                <w:b w:val="false"/>
+                <w:bCs w:val="false"/>
+                <w:i w:val="false"/>
+                <w:iCs w:val="false"/>
+                <w:color w:val="000000"/>
+                <w:sz w:val="20"/>
+                <w:szCs w:val="20"/>
+              </w:rPr>
+              <w:t xml:space="preserve">Trois justifications : (1) Absence de consensus empirique sur la hiérarchie souveraine africaine. (2) Neutralité politique — toute pondération différenciée sera perçue comme un choix politique. (3) Priorité à la validation académique avant différenciation — les données 2025–2027 permettront une révision éclairée.</w:t>
+            </w:r>
+          </w:p>
+        </w:tc>
+      </w:tr>
+      <w:tr>
+        <w:tc>
+          <w:tcPr>
+            <w:tcW w:type="dxa" w:w="1800"/>
+            <w:tcBorders>
+              <w:top w:val="single" w:color="CCCCCC" w:sz="1"/>
+              <w:left w:val="single" w:color="CCCCCC" w:sz="1"/>
+              <w:bottom w:val="single" w:color="CCCCCC" w:sz="1"/>
+              <w:right w:val="single" w:color="CCCCCC" w:sz="1"/>
+            </w:tcBorders>
+            <w:shd w:fill="D6E4F0" w:val="clear"/>
+            <w:tcMar>
+              <w:top w:type="dxa" w:w="80"/>
+              <w:left w:type="dxa" w:w="120"/>
+              <w:bottom w:type="dxa" w:w="80"/>
+              <w:right w:type="dxa" w:w="120"/>
+            </w:tcMar>
+            <w:vAlign w:val="top"/>
+          </w:tcPr>
+          <w:p>
+            <w:pPr>
+              <w:jc w:val="left"/>
+            </w:pPr>
+            <w:r>
+              <w:rPr>
+                <w:rFonts w:ascii="Arial" w:cs="Arial" w:eastAsia="Arial" w:hAnsi="Arial"/>
+                <w:b/>
+                <w:bCs/>
+                <w:i w:val="false"/>
+                <w:iCs w:val="false"/>
+                <w:color w:val="1F4E79"/>
+                <w:sz w:val="20"/>
+                <w:szCs w:val="20"/>
+              </w:rPr>
+              <w:t xml:space="preserve">HOW — Comment</w:t>
+            </w:r>
+          </w:p>
+        </w:tc>
+        <w:tc>
+          <w:tcPr>
+            <w:tcW w:type="dxa" w:w="7560"/>
+            <w:tcBorders>
+              <w:top w:val="single" w:color="CCCCCC" w:sz="1"/>
+              <w:left w:val="single" w:color="CCCCCC" w:sz="1"/>
+              <w:bottom w:val="single" w:color="CCCCCC" w:sz="1"/>
+              <w:right w:val="single" w:color="CCCCCC" w:sz="1"/>
+            </w:tcBorders>
+            <w:tcMar>
+              <w:top w:type="dxa" w:w="80"/>
+              <w:left w:type="dxa" w:w="120"/>
+              <w:bottom w:type="dxa" w:w="80"/>
+              <w:right w:type="dxa" w:w="120"/>
+            </w:tcMar>
+            <w:vAlign w:val="top"/>
+          </w:tcPr>
+          <w:p>
+            <w:pPr>
+              <w:jc w:val="left"/>
+            </w:pPr>
+            <w:r>
+              <w:rPr>
+                <w:rFonts w:ascii="Arial" w:cs="Arial" w:eastAsia="Arial" w:hAnsi="Arial"/>
+                <w:b w:val="false"/>
+                <w:bCs w:val="false"/>
+                <w:i w:val="false"/>
+                <w:iCs w:val="false"/>
+                <w:color w:val="000000"/>
+                <w:sz w:val="20"/>
+                <w:szCs w:val="20"/>
+              </w:rPr>
+              <w:t xml:space="preserve">Présentation D1 Monte Carlo (robustesse 0,847). Analyse des 5 pays les plus sensibles. Discussion implications pour négociations UA/CEA/BAD. Vote formel.</w:t>
+            </w:r>
+          </w:p>
+        </w:tc>
+      </w:tr>
+      <w:tr>
+        <w:tc>
+          <w:tcPr>
+            <w:tcW w:type="dxa" w:w="1800"/>
+            <w:tcBorders>
+              <w:top w:val="single" w:color="CCCCCC" w:sz="1"/>
+              <w:left w:val="single" w:color="CCCCCC" w:sz="1"/>
+              <w:bottom w:val="single" w:color="CCCCCC" w:sz="1"/>
+              <w:right w:val="single" w:color="CCCCCC" w:sz="1"/>
+            </w:tcBorders>
+            <w:shd w:fill="D6E4F0" w:val="clear"/>
+            <w:tcMar>
+              <w:top w:type="dxa" w:w="80"/>
+              <w:left w:type="dxa" w:w="120"/>
+              <w:bottom w:type="dxa" w:w="80"/>
+              <w:right w:type="dxa" w:w="120"/>
+            </w:tcMar>
+            <w:vAlign w:val="top"/>
+          </w:tcPr>
+          <w:p>
+            <w:pPr>
+              <w:jc w:val="left"/>
+            </w:pPr>
+            <w:r>
+              <w:rPr>
+                <w:rFonts w:ascii="Arial" w:cs="Arial" w:eastAsia="Arial" w:hAnsi="Arial"/>
+                <w:b/>
+                <w:bCs/>
+                <w:i w:val="false"/>
+                <w:iCs w:val="false"/>
+                <w:color w:val="1F4E79"/>
+                <w:sz w:val="20"/>
+                <w:szCs w:val="20"/>
+              </w:rPr>
+              <w:t xml:space="preserve">Règle de vote</w:t>
+            </w:r>
+          </w:p>
+        </w:tc>
+        <w:tc>
+          <w:tcPr>
+            <w:tcW w:type="dxa" w:w="7560"/>
+            <w:tcBorders>
+              <w:top w:val="single" w:color="CCCCCC" w:sz="1"/>
+              <w:left w:val="single" w:color="CCCCCC" w:sz="1"/>
+              <w:bottom w:val="single" w:color="CCCCCC" w:sz="1"/>
+              <w:right w:val="single" w:color="CCCCCC" w:sz="1"/>
+            </w:tcBorders>
+            <w:tcMar>
+              <w:top w:type="dxa" w:w="80"/>
+              <w:left w:type="dxa" w:w="120"/>
+              <w:bottom w:type="dxa" w:w="80"/>
+              <w:right w:type="dxa" w:w="120"/>
+            </w:tcMar>
+            <w:vAlign w:val="top"/>
+          </w:tcPr>
+          <w:p>
+            <w:pPr>
+              <w:jc w:val="left"/>
+            </w:pPr>
+            <w:r>
+              <w:rPr>
+                <w:rFonts w:ascii="Arial" w:cs="Arial" w:eastAsia="Arial" w:hAnsi="Arial"/>
+                <w:b w:val="false"/>
+                <w:bCs w:val="false"/>
+                <w:i w:val="false"/>
+                <w:iCs w:val="false"/>
+                <w:color w:val="000000"/>
+                <w:sz w:val="20"/>
+                <w:szCs w:val="20"/>
+              </w:rPr>
+              <w:t xml:space="preserve">Majorité qualifiée 2/3 — Quorum 6/7. Nature : décision de gouvernance avec conséquences institutionnelles.</w:t>
+            </w:r>
+          </w:p>
+        </w:tc>
+      </w:tr>
+    </w:tbl>
+    <w:p>
+      <w:pPr>
+        <w:spacing w:after="100" w:before="100"/>
+      </w:pPr>
+      <w:r>
+        <w:t xml:space="preserve"/>
+      </w:r>
+    </w:p>
+    <w:p>
+      <w:pPr>
+        <w:pStyle w:val="Heading2"/>
+        <w:spacing w:after="120" w:before="240"/>
+      </w:pPr>
+      <w:r>
+        <w:rPr>
+          <w:rFonts w:ascii="Arial" w:cs="Arial" w:eastAsia="Arial" w:hAnsi="Arial"/>
+          <w:b/>
+          <w:bCs/>
+          <w:color w:val="2E75B6"/>
+          <w:sz w:val="26"/>
+          <w:szCs w:val="26"/>
+        </w:rPr>
+        <w:t xml:space="preserve">Analyse SWOT — Double certification</w:t>
+      </w:r>
+    </w:p>
+    <w:tbl>
+      <w:tblPr>
+        <w:tblW w:type="dxa" w:w="9360"/>
+        <w:tblBorders>
+          <w:top w:val="single" w:color="auto" w:sz="4"/>
+          <w:left w:val="single" w:color="auto" w:sz="4"/>
+          <w:bottom w:val="single" w:color="auto" w:sz="4"/>
+          <w:right w:val="single" w:color="auto" w:sz="4"/>
+          <w:insideH w:val="single" w:color="auto" w:sz="4"/>
+          <w:insideV w:val="single" w:color="auto" w:sz="4"/>
+        </w:tblBorders>
+      </w:tblPr>
+      <w:tblGrid>
+        <w:gridCol w:w="4680"/>
+        <w:gridCol w:w="4680"/>
+      </w:tblGrid>
+      <w:tr>
+        <w:tc>
+          <w:tcPr>
+            <w:tcW w:type="dxa" w:w="4680"/>
+            <w:tcBorders>
+              <w:top w:val="single" w:color="CCCCCC" w:sz="1"/>
+              <w:left w:val="single" w:color="CCCCCC" w:sz="1"/>
+              <w:bottom w:val="single" w:color="CCCCCC" w:sz="1"/>
+              <w:right w:val="single" w:color="CCCCCC" w:sz="1"/>
+            </w:tcBorders>
+            <w:shd w:fill="E2EFDA" w:val="clear"/>
+            <w:tcMar>
+              <w:top w:type="dxa" w:w="100"/>
+              <w:left w:type="dxa" w:w="120"/>
+              <w:bottom w:type="dxa" w:w="100"/>
+              <w:right w:type="dxa" w:w="120"/>
+            </w:tcMar>
+          </w:tcPr>
+          <w:p>
+            <w:r>
+              <w:rPr>
+                <w:rFonts w:ascii="Arial" w:cs="Arial" w:eastAsia="Arial" w:hAnsi="Arial"/>
+                <w:b/>
+                <w:bCs/>
+                <w:color w:val="375623"/>
+                <w:sz w:val="20"/>
+                <w:szCs w:val="20"/>
+              </w:rPr>
+              <w:t xml:space="preserve">Forces</w:t>
+            </w:r>
+          </w:p>
+          <w:p>
+            <w:pPr>
+              <w:spacing w:before="40"/>
+            </w:pPr>
+            <w:r>
+              <w:rPr>
+                <w:rFonts w:ascii="Arial" w:cs="Arial" w:eastAsia="Arial" w:hAnsi="Arial"/>
+                <w:color w:val="375623"/>
+                <w:sz w:val="20"/>
+                <w:szCs w:val="20"/>
+              </w:rPr>
+              <w:t xml:space="preserve">•  </w:t>
+            </w:r>
+            <w:r>
+              <w:rPr>
+                <w:rFonts w:ascii="Arial" w:cs="Arial" w:eastAsia="Arial" w:hAnsi="Arial"/>
+                <w:sz w:val="20"/>
+                <w:szCs w:val="20"/>
+              </w:rPr>
+              <w:t xml:space="preserve">Chaîne de validation complète : indicateurs + piliers</w:t>
+            </w:r>
+          </w:p>
+          <w:p>
+            <w:pPr>
+              <w:spacing w:before="40"/>
+            </w:pPr>
+            <w:r>
+              <w:rPr>
+                <w:rFonts w:ascii="Arial" w:cs="Arial" w:eastAsia="Arial" w:hAnsi="Arial"/>
+                <w:color w:val="375623"/>
+                <w:sz w:val="20"/>
+                <w:szCs w:val="20"/>
+              </w:rPr>
+              <w:t xml:space="preserve">•  </w:t>
+            </w:r>
+            <w:r>
+              <w:rPr>
+                <w:rFonts w:ascii="Arial" w:cs="Arial" w:eastAsia="Arial" w:hAnsi="Arial"/>
+                <w:sz w:val="20"/>
+                <w:szCs w:val="20"/>
+              </w:rPr>
+              <w:t xml:space="preserve">D2 = 0,959 confirme la robustesse de P7B</w:t>
+            </w:r>
+          </w:p>
+          <w:p>
+            <w:pPr>
+              <w:spacing w:before="40"/>
+            </w:pPr>
+            <w:r>
+              <w:rPr>
+                <w:rFonts w:ascii="Arial" w:cs="Arial" w:eastAsia="Arial" w:hAnsi="Arial"/>
+                <w:color w:val="375623"/>
+                <w:sz w:val="20"/>
+                <w:szCs w:val="20"/>
+              </w:rPr>
+              <w:t xml:space="preserve">•  </w:t>
+            </w:r>
+            <w:r>
+              <w:rPr>
+                <w:rFonts w:ascii="Arial" w:cs="Arial" w:eastAsia="Arial" w:hAnsi="Arial"/>
+                <w:sz w:val="20"/>
+                <w:szCs w:val="20"/>
+              </w:rPr>
+              <w:t xml:space="preserve">D1 = 0,847 confirme la défendabilité de l’égalité piliers</w:t>
+            </w:r>
+          </w:p>
+          <w:p>
+            <w:pPr>
+              <w:spacing w:before="40"/>
+            </w:pPr>
+            <w:r>
+              <w:rPr>
+                <w:rFonts w:ascii="Arial" w:cs="Arial" w:eastAsia="Arial" w:hAnsi="Arial"/>
+                <w:color w:val="375623"/>
+                <w:sz w:val="20"/>
+                <w:szCs w:val="20"/>
+              </w:rPr>
+              <w:t xml:space="preserve">•  </w:t>
+            </w:r>
+            <w:r>
+              <w:rPr>
+                <w:rFonts w:ascii="Arial" w:cs="Arial" w:eastAsia="Arial" w:hAnsi="Arial"/>
+                <w:sz w:val="20"/>
+                <w:szCs w:val="20"/>
+              </w:rPr>
+              <w:t xml:space="preserve">Transparence totale — deux décisions distinctes clairement documentées</w:t>
+            </w:r>
+          </w:p>
+        </w:tc>
+        <w:tc>
+          <w:tcPr>
+            <w:tcW w:type="dxa" w:w="4680"/>
+            <w:tcBorders>
+              <w:top w:val="single" w:color="CCCCCC" w:sz="1"/>
+              <w:left w:val="single" w:color="CCCCCC" w:sz="1"/>
+              <w:bottom w:val="single" w:color="CCCCCC" w:sz="1"/>
+              <w:right w:val="single" w:color="CCCCCC" w:sz="1"/>
+            </w:tcBorders>
+            <w:shd w:fill="FCE4D6" w:val="clear"/>
+            <w:tcMar>
+              <w:top w:type="dxa" w:w="100"/>
+              <w:left w:type="dxa" w:w="120"/>
+              <w:bottom w:type="dxa" w:w="100"/>
+              <w:right w:type="dxa" w:w="120"/>
+            </w:tcMar>
+          </w:tcPr>
+          <w:p>
+            <w:r>
+              <w:rPr>
+                <w:rFonts w:ascii="Arial" w:cs="Arial" w:eastAsia="Arial" w:hAnsi="Arial"/>
+                <w:b/>
+                <w:bCs/>
+                <w:color w:val="C00000"/>
+                <w:sz w:val="20"/>
+                <w:szCs w:val="20"/>
+              </w:rPr>
+              <w:t xml:space="preserve">Faiblesses</w:t>
+            </w:r>
+          </w:p>
+          <w:p>
+            <w:pPr>
+              <w:spacing w:before="40"/>
+            </w:pPr>
+            <w:r>
+              <w:rPr>
+                <w:rFonts w:ascii="Arial" w:cs="Arial" w:eastAsia="Arial" w:hAnsi="Arial"/>
+                <w:color w:val="C00000"/>
+                <w:sz w:val="20"/>
+                <w:szCs w:val="20"/>
+              </w:rPr>
+              <w:t xml:space="preserve">•  </w:t>
+            </w:r>
+            <w:r>
+              <w:rPr>
+                <w:rFonts w:ascii="Arial" w:cs="Arial" w:eastAsia="Arial" w:hAnsi="Arial"/>
+                <w:sz w:val="20"/>
+                <w:szCs w:val="20"/>
+              </w:rPr>
+              <w:t xml:space="preserve">Complexité pédagogique — expliquer deux niveaux de pondération</w:t>
+            </w:r>
+          </w:p>
+          <w:p>
+            <w:pPr>
+              <w:spacing w:before="40"/>
+            </w:pPr>
+            <w:r>
+              <w:rPr>
+                <w:rFonts w:ascii="Arial" w:cs="Arial" w:eastAsia="Arial" w:hAnsi="Arial"/>
+                <w:color w:val="C00000"/>
+                <w:sz w:val="20"/>
+                <w:szCs w:val="20"/>
+              </w:rPr>
+              <w:t xml:space="preserve">•  </w:t>
+            </w:r>
+            <w:r>
+              <w:rPr>
+                <w:rFonts w:ascii="Arial" w:cs="Arial" w:eastAsia="Arial" w:hAnsi="Arial"/>
+                <w:sz w:val="20"/>
+                <w:szCs w:val="20"/>
+              </w:rPr>
+              <w:t xml:space="preserve">P7B peut sembler opaque sans présentation détaillée</w:t>
+            </w:r>
+          </w:p>
+          <w:p>
+            <w:pPr>
+              <w:spacing w:before="40"/>
+            </w:pPr>
+            <w:r>
+              <w:rPr>
+                <w:rFonts w:ascii="Arial" w:cs="Arial" w:eastAsia="Arial" w:hAnsi="Arial"/>
+                <w:color w:val="C00000"/>
+                <w:sz w:val="20"/>
+                <w:szCs w:val="20"/>
+              </w:rPr>
+              <w:t xml:space="preserve">•  </w:t>
+            </w:r>
+            <w:r>
+              <w:rPr>
+                <w:rFonts w:ascii="Arial" w:cs="Arial" w:eastAsia="Arial" w:hAnsi="Arial"/>
+                <w:sz w:val="20"/>
+                <w:szCs w:val="20"/>
+              </w:rPr>
+              <w:t xml:space="preserve">Risque de remise en question de P7B par des membres non familiers</w:t>
+            </w:r>
+          </w:p>
+        </w:tc>
+      </w:tr>
+      <w:tr>
+        <w:tc>
+          <w:tcPr>
+            <w:tcW w:type="dxa" w:w="4680"/>
+            <w:tcBorders>
+              <w:top w:val="single" w:color="CCCCCC" w:sz="1"/>
+              <w:left w:val="single" w:color="CCCCCC" w:sz="1"/>
+              <w:bottom w:val="single" w:color="CCCCCC" w:sz="1"/>
+              <w:right w:val="single" w:color="CCCCCC" w:sz="1"/>
+            </w:tcBorders>
+            <w:shd w:fill="D6E4F0" w:val="clear"/>
+            <w:tcMar>
+              <w:top w:type="dxa" w:w="100"/>
+              <w:left w:type="dxa" w:w="120"/>
+              <w:bottom w:type="dxa" w:w="100"/>
+              <w:right w:type="dxa" w:w="120"/>
+            </w:tcMar>
+          </w:tcPr>
+          <w:p>
+            <w:r>
+              <w:rPr>
+                <w:rFonts w:ascii="Arial" w:cs="Arial" w:eastAsia="Arial" w:hAnsi="Arial"/>
+                <w:b/>
+                <w:bCs/>
+                <w:color w:val="2E75B6"/>
+                <w:sz w:val="20"/>
+                <w:szCs w:val="20"/>
+              </w:rPr>
+              <w:t xml:space="preserve">Opportunités</w:t>
+            </w:r>
+          </w:p>
+          <w:p>
+            <w:pPr>
+              <w:spacing w:before="40"/>
+            </w:pPr>
+            <w:r>
+              <w:rPr>
+                <w:rFonts w:ascii="Arial" w:cs="Arial" w:eastAsia="Arial" w:hAnsi="Arial"/>
+                <w:color w:val="2E75B6"/>
+                <w:sz w:val="20"/>
+                <w:szCs w:val="20"/>
+              </w:rPr>
+              <w:t xml:space="preserve">•  </w:t>
+            </w:r>
+            <w:r>
+              <w:rPr>
+                <w:rFonts w:ascii="Arial" w:cs="Arial" w:eastAsia="Arial" w:hAnsi="Arial"/>
+                <w:sz w:val="20"/>
+                <w:szCs w:val="20"/>
+              </w:rPr>
+              <w:t xml:space="preserve">Première validation académique d’une architecture de pondération sémantique africaine</w:t>
+            </w:r>
+          </w:p>
+          <w:p>
+            <w:pPr>
+              <w:spacing w:before="40"/>
+            </w:pPr>
+            <w:r>
+              <w:rPr>
+                <w:rFonts w:ascii="Arial" w:cs="Arial" w:eastAsia="Arial" w:hAnsi="Arial"/>
+                <w:color w:val="2E75B6"/>
+                <w:sz w:val="20"/>
+                <w:szCs w:val="20"/>
+              </w:rPr>
+              <w:t xml:space="preserve">•  </w:t>
+            </w:r>
+            <w:r>
+              <w:rPr>
+                <w:rFonts w:ascii="Arial" w:cs="Arial" w:eastAsia="Arial" w:hAnsi="Arial"/>
+                <w:sz w:val="20"/>
+                <w:szCs w:val="20"/>
+              </w:rPr>
+              <w:t xml:space="preserve">D2 = 0,959 est un argument fort</w:t>
+            </w:r>
+          </w:p>
+          <w:p>
+            <w:pPr>
+              <w:spacing w:before="40"/>
+            </w:pPr>
+            <w:r>
+              <w:rPr>
+                <w:rFonts w:ascii="Arial" w:cs="Arial" w:eastAsia="Arial" w:hAnsi="Arial"/>
+                <w:color w:val="2E75B6"/>
+                <w:sz w:val="20"/>
+                <w:szCs w:val="20"/>
+              </w:rPr>
+              <w:t xml:space="preserve">•  </w:t>
+            </w:r>
+            <w:r>
+              <w:rPr>
+                <w:rFonts w:ascii="Arial" w:cs="Arial" w:eastAsia="Arial" w:hAnsi="Arial"/>
+                <w:sz w:val="20"/>
+                <w:szCs w:val="20"/>
+              </w:rPr>
+              <w:t xml:space="preserve">Valorise le travail technique Sprint 7–8 (gouvernance P7B)</w:t>
+            </w:r>
+          </w:p>
+        </w:tc>
+        <w:tc>
+          <w:tcPr>
+            <w:tcW w:type="dxa" w:w="4680"/>
+            <w:tcBorders>
+              <w:top w:val="single" w:color="CCCCCC" w:sz="1"/>
+              <w:left w:val="single" w:color="CCCCCC" w:sz="1"/>
+              <w:bottom w:val="single" w:color="CCCCCC" w:sz="1"/>
+              <w:right w:val="single" w:color="CCCCCC" w:sz="1"/>
+            </w:tcBorders>
+            <w:shd w:fill="FFF2CC" w:val="clear"/>
+            <w:tcMar>
+              <w:top w:type="dxa" w:w="100"/>
+              <w:left w:type="dxa" w:w="120"/>
+              <w:bottom w:type="dxa" w:w="100"/>
+              <w:right w:type="dxa" w:w="120"/>
+            </w:tcMar>
+          </w:tcPr>
+          <w:p>
+            <w:r>
+              <w:rPr>
+                <w:rFonts w:ascii="Arial" w:cs="Arial" w:eastAsia="Arial" w:hAnsi="Arial"/>
+                <w:b/>
+                <w:bCs/>
+                <w:color w:val="7F6000"/>
+                <w:sz w:val="20"/>
+                <w:szCs w:val="20"/>
+              </w:rPr>
+              <w:t xml:space="preserve">Menaces</w:t>
+            </w:r>
+          </w:p>
+          <w:p>
+            <w:pPr>
+              <w:spacing w:before="40"/>
+            </w:pPr>
+            <w:r>
+              <w:rPr>
+                <w:rFonts w:ascii="Arial" w:cs="Arial" w:eastAsia="Arial" w:hAnsi="Arial"/>
+                <w:color w:val="7F6000"/>
+                <w:sz w:val="20"/>
+                <w:szCs w:val="20"/>
+              </w:rPr>
+              <w:t xml:space="preserve">•  </w:t>
+            </w:r>
+            <w:r>
+              <w:rPr>
+                <w:rFonts w:ascii="Arial" w:cs="Arial" w:eastAsia="Arial" w:hAnsi="Arial"/>
+                <w:sz w:val="20"/>
+                <w:szCs w:val="20"/>
+              </w:rPr>
+              <w:t xml:space="preserve">Un membre pourrait proposer une pondération égale des indicateurs</w:t>
+            </w:r>
+          </w:p>
+          <w:p>
+            <w:pPr>
+              <w:spacing w:before="40"/>
+            </w:pPr>
+            <w:r>
+              <w:rPr>
+                <w:rFonts w:ascii="Arial" w:cs="Arial" w:eastAsia="Arial" w:hAnsi="Arial"/>
+                <w:color w:val="7F6000"/>
+                <w:sz w:val="20"/>
+                <w:szCs w:val="20"/>
+              </w:rPr>
+              <w:t xml:space="preserve">•  </w:t>
+            </w:r>
+            <w:r>
+              <w:rPr>
+                <w:rFonts w:ascii="Arial" w:cs="Arial" w:eastAsia="Arial" w:hAnsi="Arial"/>
+                <w:sz w:val="20"/>
+                <w:szCs w:val="20"/>
+              </w:rPr>
+              <w:t xml:space="preserve">Discussion technique longue empiétant sur V1</w:t>
+            </w:r>
+          </w:p>
+          <w:p>
+            <w:pPr>
+              <w:spacing w:before="40"/>
+            </w:pPr>
+            <w:r>
+              <w:rPr>
+                <w:rFonts w:ascii="Arial" w:cs="Arial" w:eastAsia="Arial" w:hAnsi="Arial"/>
+                <w:color w:val="7F6000"/>
+                <w:sz w:val="20"/>
+                <w:szCs w:val="20"/>
+              </w:rPr>
+              <w:t xml:space="preserve">•  </w:t>
+            </w:r>
+            <w:r>
+              <w:rPr>
+                <w:rFonts w:ascii="Arial" w:cs="Arial" w:eastAsia="Arial" w:hAnsi="Arial"/>
+                <w:sz w:val="20"/>
+                <w:szCs w:val="20"/>
+              </w:rPr>
+              <w:t xml:space="preserve">Risque de confusion entre les deux votes</w:t>
+            </w:r>
+          </w:p>
+        </w:tc>
+      </w:tr>
+    </w:tbl>
+    <w:p>
+      <w:pPr>
+        <w:spacing w:after="100" w:before="100"/>
+      </w:pPr>
+      <w:r>
+        <w:t xml:space="preserve"/>
+      </w:r>
+    </w:p>
+    <w:p>
+      <w:pPr>
+        <w:pStyle w:val="Heading2"/>
+        <w:spacing w:after="120" w:before="240"/>
+      </w:pPr>
+      <w:r>
+        <w:rPr>
+          <w:rFonts w:ascii="Arial" w:cs="Arial" w:eastAsia="Arial" w:hAnsi="Arial"/>
+          <w:b/>
+          <w:bCs/>
+          <w:color w:val="2E75B6"/>
+          <w:sz w:val="26"/>
+          <w:szCs w:val="26"/>
+        </w:rPr>
+        <w:t xml:space="preserve">Séquence de certification recommandée</w:t>
       </w:r>
     </w:p>
     <w:tbl>
@@ -2284,7 +3679,7 @@
                 <w:sz w:val="20"/>
                 <w:szCs w:val="20"/>
               </w:rPr>
-              <w:t xml:space="preserve">Transmission du rapport Monte Carlo complet + scores piliers 2022 des 54 pays + analyse détaillée des 5 pays les plus sensibles.</w:t>
+              <w:t xml:space="preserve">Transmission rapport Monte Carlo + présentation P7B (13 codes, 5 dimensions, valeurs) + scores piliers 2022 des 54 pays.</w:t>
             </w:r>
           </w:p>
         </w:tc>
@@ -2382,7 +3777,7 @@
                 <w:sz w:val="20"/>
                 <w:szCs w:val="20"/>
               </w:rPr>
-              <w:t xml:space="preserve">Session de travail préparatoire. Présentation D1. Questions sur SYC, COD, et cas atypiques. Discussion pondérations différenciées alternatives.</w:t>
+              <w:t xml:space="preserve">Session préparatoire : présentation P7B et D2. Questions sur l’architecture sémantique. Présentation D1 et cas SYC.</w:t>
             </w:r>
           </w:p>
         </w:tc>
@@ -2480,7 +3875,7 @@
                 <w:sz w:val="20"/>
                 <w:szCs w:val="20"/>
               </w:rPr>
-              <w:t xml:space="preserve">Vote formel. Motion : « Le Conseil certifie la pondération égale 0,10/pilier comme référence officielle ISA_P7E_V1 pour la période 2022–2024. » Quorum : 6/7. Majorité qualifiée : 2/3.</w:t>
+              <w:t xml:space="preserve">Vote V2 (pondération sémantique indicateurs) : majorité simple 4/5. Puis Vote V1 (pondération égale piliers) : majorité qualifiée 2/3. Signature certificat ISA_P7E_V1.</w:t>
             </w:r>
           </w:p>
         </w:tc>
@@ -2548,7 +3943,7 @@
                 <w:sz w:val="20"/>
                 <w:szCs w:val="20"/>
               </w:rPr>
-              <w:t xml:space="preserve">J+30 — Conseil</w:t>
+              <w:t xml:space="preserve">J+30 — Secrétariat</w:t>
             </w:r>
           </w:p>
         </w:tc>
@@ -2578,7 +3973,7 @@
                 <w:sz w:val="20"/>
                 <w:szCs w:val="20"/>
               </w:rPr>
-              <w:t xml:space="preserve">Inscription à l’ordre du jour session janvier 2029 : première révision des pondérations sur la base des données 2025–2027.</w:t>
+              <w:t xml:space="preserve">Publication rapport de certification incluant les deux votes. Inscription révision V1 à l’ordre du jour session janvier 2029.</w:t>
             </w:r>
           </w:p>
         </w:tc>

</xml_diff>